<commit_message>
docs: Lab 1 and Lab 4 — learners work on their own copy of the site; the public site is only the link in posts
Co-Authored-By: Claude Opus 5.5 <noreply@anthropic.com>
</commit_message>
<xml_diff>
--- a/courseware_chatgpt/LG-Multi AI Agents Workflow for Content Creation - ChatGPT-v3.5.docx
+++ b/courseware_chatgpt/LG-Multi AI Agents Workflow for Content Creation - ChatGPT-v3.5.docx
@@ -6576,7 +6576,7 @@
         <w:rPr>
           <w:b w:val="0"/>
         </w:rPr>
-        <w:t xml:space="preserve"> October 2026. Rachel has a website and a goal: 40 booked chats a month by March. She has no marketing team. Before you hire one made of agents, give it a home — shared rules, shared facts — and put the website online.</w:t>
+        <w:t xml:space="preserve"> October 2026. Rachel has a website and a goal: 40 booked chats a month by March. She has no marketing team. Before you hire one made of agents, give it a home — shared rules, shared facts — and open your own copy of Horizon's website.</w:t>
       </w:r>
     </w:p>
     <w:p>
@@ -6590,7 +6590,7 @@
         <w:rPr>
           <w:b w:val="0"/>
         </w:rPr>
-        <w:t xml:space="preserve"> Before anyone builds a team, the team needs a home: one folder of shared facts and rules, and Horizon's website — already live at one public link every post points to.</w:t>
+        <w:t xml:space="preserve"> Before anyone builds a team, the team needs a home: one folder of shared facts and rules, your own copy of Horizon's website to work on, and the one public link every post points to.</w:t>
       </w:r>
     </w:p>
     <w:p>
@@ -6623,7 +6623,7 @@
         <w:rPr>
           <w:b/>
         </w:rPr>
-        <w:t>Website:</w:t>
+        <w:t>Public site (the link in every post):</w:t>
       </w:r>
       <w:r>
         <w:rPr>
@@ -7022,7 +7022,7 @@
         <w:rPr>
           <w:sz w:val="21"/>
         </w:rPr>
-        <w:t>Read data/team-charter.md, data/team-design.md and data/business-brief.md. Write AGENTS.md for this studio in four sections — What this is, The team, Rules, Files — under 60 lines. The team is the one I chose in data/team-design.md. Rules: every number comes from data/facts-2026.md; every piece passes fact-check and fin-compliance; nothing is published or sent without a person's approval (the one exception: a review email to the approver); anything shown to me is in plain English for a business owner, with no codes, IDs, file names or line numbers. In Files, add:</w:t>
+        <w:t>Read data/team-charter.md, data/team-design.md and data/business-brief.md. Write AGENTS.md for this studio in four sections — What this is, The team, Rules, Files — under 60 lines. The team is the one I chose in data/team-design.md. Rules: every number comes from data/facts-2026.md; every piece passes fact-check and fin-compliance; nothing is published or sent without a person's approval (the one exception: a review email to the approver); anything shown to me is in plain English for a business owner, with no codes, IDs, file names or line numbers. In Files, add two lines:</w:t>
       </w:r>
       <w:r>
         <w:br/>
@@ -7031,7 +7031,25 @@
         <w:rPr>
           <w:sz w:val="21"/>
         </w:rPr>
-        <w:t>Public site (link in every post): https://tertiarycourses.github.io/TGS-2023036153-Multi-AI-Agents-Workflow-for-Content-Creation/</w:t>
+        <w:t>- Our copy of the site, which we edit and preview:</w:t>
+      </w:r>
+      <w:r>
+        <w:br/>
+      </w:r>
+      <w:r>
+        <w:rPr>
+          <w:sz w:val="21"/>
+        </w:rPr>
+        <w:t xml:space="preserve">  web/site/index.html</w:t>
+      </w:r>
+      <w:r>
+        <w:br/>
+      </w:r>
+      <w:r>
+        <w:rPr>
+          <w:sz w:val="21"/>
+        </w:rPr>
+        <w:t>- Public site, the link every post points to (it never changes): https://tertiarycourses.github.io/TGS-2023036153-Multi-AI-Agents-Workflow-for-Content-Creation/</w:t>
       </w:r>
     </w:p>
     <w:p>
@@ -7094,7 +7112,7 @@
         <w:rPr>
           <w:b w:val="0"/>
         </w:rPr>
-        <w:t>☐  AGENTS.md names the public site link every post points to.</w:t>
+        <w:t>☐  AGENTS.md names your copy of the site and the public link every post points to.</w:t>
       </w:r>
     </w:p>
     <w:p>
@@ -9553,7 +9571,7 @@
         <w:rPr>
           <w:sz w:val="21"/>
         </w:rPr>
-        <w:t>5. website-designer: @Computer Use — open Horizon's public site at mobile width and report any problem. Report each result in one line.</w:t>
+        <w:t>5. website-designer: @Computer Use — open our own copy of the site (web/site/index.html) at mobile width and report any problem. Report each result in one line.</w:t>
       </w:r>
     </w:p>
     <w:p>

</xml_diff>

<commit_message>
docs: course outline, lab materials, which app and lesson plan slides follow Learning Outcomes
Co-Authored-By: Claude Opus 5.5 <noreply@anthropic.com>
</commit_message>
<xml_diff>
--- a/courseware_chatgpt/LG-Multi AI Agents Workflow for Content Creation - ChatGPT-v3.5.docx
+++ b/courseware_chatgpt/LG-Multi AI Agents Workflow for Content Creation - ChatGPT-v3.5.docx
@@ -856,7 +856,7 @@
           <w:b w:val="0"/>
           <w:sz w:val="19"/>
         </w:rPr>
-        <w:t>ChatGPT, ChatGPT Work and Codex</w:t>
+        <w:t>Course Outline</w:t>
         <w:tab/>
         <w:t>8</w:t>
       </w:r>
@@ -874,7 +874,7 @@
           <w:b w:val="0"/>
           <w:sz w:val="19"/>
         </w:rPr>
-        <w:t>Which Plan Has What</w:t>
+        <w:t>Lab Materials</w:t>
         <w:tab/>
         <w:t>8</w:t>
       </w:r>
@@ -892,7 +892,7 @@
           <w:b w:val="0"/>
           <w:sz w:val="19"/>
         </w:rPr>
-        <w:t>A Brief History of AI, 2023–2026</w:t>
+        <w:t>ChatGPT or Codex?</w:t>
         <w:tab/>
         <w:t>8</w:t>
       </w:r>
@@ -910,9 +910,9 @@
           <w:b w:val="0"/>
           <w:sz w:val="19"/>
         </w:rPr>
-        <w:t>What Is a Harness?</w:t>
+        <w:t>Lesson Plan (9:00 AM – 6:00 PM)</w:t>
         <w:tab/>
-        <w:t>8</w:t>
+        <w:t>9</w:t>
       </w:r>
     </w:p>
     <w:p>
@@ -928,7 +928,7 @@
           <w:b w:val="0"/>
           <w:sz w:val="19"/>
         </w:rPr>
-        <w:t>The Agentic Loop</w:t>
+        <w:t>ChatGPT, ChatGPT Work and Codex</w:t>
         <w:tab/>
         <w:t>9</w:t>
       </w:r>
@@ -946,7 +946,7 @@
           <w:b w:val="0"/>
           <w:sz w:val="19"/>
         </w:rPr>
-        <w:t>Why the Loop Matters</w:t>
+        <w:t>Which Plan Has What</w:t>
         <w:tab/>
         <w:t>9</w:t>
       </w:r>
@@ -964,7 +964,7 @@
           <w:b w:val="0"/>
           <w:sz w:val="19"/>
         </w:rPr>
-        <w:t>Agentic AI vs AI Agents</w:t>
+        <w:t>A Brief History of AI, 2023–2026</w:t>
         <w:tab/>
         <w:t>9</w:t>
       </w:r>
@@ -982,7 +982,7 @@
           <w:b w:val="0"/>
           <w:sz w:val="19"/>
         </w:rPr>
-        <w:t>What Is an Agent Made Of?</w:t>
+        <w:t>What Is a Harness?</w:t>
         <w:tab/>
         <w:t>10</w:t>
       </w:r>
@@ -1000,7 +1000,7 @@
           <w:b w:val="0"/>
           <w:sz w:val="19"/>
         </w:rPr>
-        <w:t>Build a Marketing Team, Then Run Campaigns</w:t>
+        <w:t>The Agentic Loop</w:t>
         <w:tab/>
         <w:t>10</w:t>
       </w:r>
@@ -1018,7 +1018,7 @@
           <w:b w:val="0"/>
           <w:sz w:val="19"/>
         </w:rPr>
-        <w:t>Meet Horizon Wealth Planning</w:t>
+        <w:t>Why the Loop Matters</w:t>
         <w:tab/>
         <w:t>10</w:t>
       </w:r>
@@ -1036,9 +1036,9 @@
           <w:b w:val="0"/>
           <w:sz w:val="19"/>
         </w:rPr>
-        <w:t>Your AI Marketing Team</w:t>
+        <w:t>Agentic AI vs AI Agents</w:t>
         <w:tab/>
-        <w:t>11</w:t>
+        <w:t>10</w:t>
       </w:r>
     </w:p>
     <w:p>
@@ -1054,7 +1054,7 @@
           <w:b w:val="0"/>
           <w:sz w:val="19"/>
         </w:rPr>
-        <w:t>Who Does What</w:t>
+        <w:t>What Is an Agent Made Of?</w:t>
         <w:tab/>
         <w:t>11</w:t>
       </w:r>
@@ -1072,9 +1072,9 @@
           <w:b w:val="0"/>
           <w:sz w:val="19"/>
         </w:rPr>
-        <w:t>The Tools for This Edition</w:t>
+        <w:t>Build a Marketing Team, Then Run Campaigns</w:t>
         <w:tab/>
-        <w:t>12</w:t>
+        <w:t>11</w:t>
       </w:r>
     </w:p>
     <w:p>
@@ -1090,9 +1090,9 @@
           <w:b w:val="0"/>
           <w:sz w:val="19"/>
         </w:rPr>
-        <w:t>Course Outline</w:t>
+        <w:t>Meet Horizon Wealth Planning</w:t>
         <w:tab/>
-        <w:t>12</w:t>
+        <w:t>11</w:t>
       </w:r>
     </w:p>
     <w:p>
@@ -1108,7 +1108,7 @@
           <w:b w:val="0"/>
           <w:sz w:val="19"/>
         </w:rPr>
-        <w:t>Lab Materials</w:t>
+        <w:t>Your AI Marketing Team</w:t>
         <w:tab/>
         <w:t>12</w:t>
       </w:r>
@@ -1126,9 +1126,9 @@
           <w:b w:val="0"/>
           <w:sz w:val="19"/>
         </w:rPr>
-        <w:t>ChatGPT or Codex?</w:t>
+        <w:t>Who Does What</w:t>
         <w:tab/>
-        <w:t>13</w:t>
+        <w:t>12</w:t>
       </w:r>
     </w:p>
     <w:p>
@@ -1144,7 +1144,7 @@
           <w:b w:val="0"/>
           <w:sz w:val="19"/>
         </w:rPr>
-        <w:t>Lesson Plan (9:00 AM – 6:00 PM)</w:t>
+        <w:t>The Tools for This Edition</w:t>
         <w:tab/>
         <w:t>13</w:t>
       </w:r>
@@ -1182,7 +1182,7 @@
         </w:rPr>
         <w:t>Key ideas for Lab 1</w:t>
         <w:tab/>
-        <w:t>14</w:t>
+        <w:t>13</w:t>
       </w:r>
     </w:p>
     <w:p>
@@ -1200,7 +1200,7 @@
         </w:rPr>
         <w:t>Why a Team of Agents?</w:t>
         <w:tab/>
-        <w:t>14</w:t>
+        <w:t>13</w:t>
       </w:r>
     </w:p>
     <w:p>
@@ -2804,6 +2804,1018 @@
           <w:b w:val="0"/>
         </w:rPr>
         <w:t xml:space="preserve"> — Develop guidelines for executing the content strategy, with suitable delivery modes and responsible AI practices.</w:t>
+      </w:r>
+    </w:p>
+    <w:p>
+      <w:pPr>
+        <w:pStyle w:val="Heading3"/>
+      </w:pPr>
+      <w:r>
+        <w:t>Course Outline</w:t>
+      </w:r>
+    </w:p>
+    <w:p>
+      <w:r>
+        <w:t>Four topics over two days. Day 1 forms the team; Day 2 runs its campaigns.</w:t>
+      </w:r>
+    </w:p>
+    <w:p>
+      <w:pPr>
+        <w:pStyle w:val="ListNumber"/>
+        <w:numPr>
+          <w:ilvl w:val="0"/>
+          <w:numId w:val="10"/>
+        </w:numPr>
+      </w:pPr>
+      <w:r>
+        <w:rPr>
+          <w:b/>
+        </w:rPr>
+        <w:t>T1 · Ideation and Storyboarding</w:t>
+      </w:r>
+      <w:r>
+        <w:rPr>
+          <w:b w:val="0"/>
+        </w:rPr>
+        <w:t xml:space="preserve"> — The studio, the team's instructions, skills and connectors; Campaign 1. Labs 1–5.</w:t>
+      </w:r>
+    </w:p>
+    <w:p>
+      <w:pPr>
+        <w:pStyle w:val="ListNumber"/>
+      </w:pPr>
+      <w:r>
+        <w:rPr>
+          <w:b/>
+        </w:rPr>
+        <w:t>T2 · Audience and Requirements</w:t>
+      </w:r>
+      <w:r>
+        <w:rPr>
+          <w:b w:val="0"/>
+        </w:rPr>
+        <w:t xml:space="preserve"> — Personas from evidence; cadence and calendar; the first blog article. Labs 6–8.</w:t>
+      </w:r>
+    </w:p>
+    <w:p>
+      <w:pPr>
+        <w:pStyle w:val="ListNumber"/>
+      </w:pPr>
+      <w:r>
+        <w:rPr>
+          <w:b/>
+        </w:rPr>
+        <w:t>T3 · Creation and Coordination</w:t>
+      </w:r>
+      <w:r>
+        <w:rPr>
+          <w:b w:val="0"/>
+        </w:rPr>
+        <w:t xml:space="preserve"> — Lead magnet, social week, newsletter + landing page, video — behind a human gate. Labs 9–12.</w:t>
+      </w:r>
+    </w:p>
+    <w:p>
+      <w:pPr>
+        <w:pStyle w:val="ListNumber"/>
+      </w:pPr>
+      <w:r>
+        <w:rPr>
+          <w:b/>
+        </w:rPr>
+        <w:t>T4 · Distribution and Responsible AI</w:t>
+      </w:r>
+      <w:r>
+        <w:rPr>
+          <w:b w:val="0"/>
+        </w:rPr>
+        <w:t xml:space="preserve"> — The weekly report on a schedule; the playbook; optional demo. Labs 13–15.</w:t>
+      </w:r>
+    </w:p>
+    <w:p>
+      <w:pPr>
+        <w:pStyle w:val="Heading3"/>
+      </w:pPr>
+      <w:r>
+        <w:t>Lab Materials</w:t>
+      </w:r>
+    </w:p>
+    <w:p>
+      <w:r>
+        <w:t>Fifteen labs, each in its own folder with a README, prompts (MD and PDF), assets, an evidence checklist and, where useful, a solution.</w:t>
+      </w:r>
+    </w:p>
+    <w:tbl>
+      <w:tblPr>
+        <w:tblStyle w:val="TableGrid"/>
+        <w:tblW w:type="auto" w:w="0"/>
+        <w:jc w:val="center"/>
+        <w:tblLayout w:type="fixed"/>
+        <w:tblLook w:firstColumn="1" w:firstRow="1" w:lastColumn="0" w:lastRow="0" w:noHBand="0" w:noVBand="1" w:val="04A0"/>
+      </w:tblPr>
+      <w:tblGrid>
+        <w:gridCol w:w="921"/>
+        <w:gridCol w:w="6082"/>
+        <w:gridCol w:w="2211"/>
+      </w:tblGrid>
+      <w:tr>
+        <w:tc>
+          <w:tcPr>
+            <w:tcW w:type="dxa" w:w="922"/>
+            <w:shd w:val="clear" w:fill="1F6FEB"/>
+          </w:tcPr>
+          <w:p>
+            <w:r/>
+            <w:r>
+              <w:rPr>
+                <w:b/>
+                <w:color w:val="FFFFFF"/>
+                <w:sz w:val="19"/>
+              </w:rPr>
+              <w:t>Day</w:t>
+            </w:r>
+          </w:p>
+        </w:tc>
+        <w:tc>
+          <w:tcPr>
+            <w:tcW w:type="dxa" w:w="6083"/>
+            <w:shd w:val="clear" w:fill="1F6FEB"/>
+          </w:tcPr>
+          <w:p>
+            <w:r/>
+            <w:r>
+              <w:rPr>
+                <w:b/>
+                <w:color w:val="FFFFFF"/>
+                <w:sz w:val="19"/>
+              </w:rPr>
+              <w:t>Labs</w:t>
+            </w:r>
+          </w:p>
+        </w:tc>
+        <w:tc>
+          <w:tcPr>
+            <w:tcW w:type="dxa" w:w="2212"/>
+            <w:shd w:val="clear" w:fill="1F6FEB"/>
+          </w:tcPr>
+          <w:p>
+            <w:r/>
+            <w:r>
+              <w:rPr>
+                <w:b/>
+                <w:color w:val="FFFFFF"/>
+                <w:sz w:val="19"/>
+              </w:rPr>
+              <w:t>Topic</w:t>
+            </w:r>
+          </w:p>
+        </w:tc>
+      </w:tr>
+      <w:tr>
+        <w:tc>
+          <w:tcPr>
+            <w:tcW w:type="dxa" w:w="922"/>
+          </w:tcPr>
+          <w:p>
+            <w:r/>
+            <w:r>
+              <w:rPr>
+                <w:sz w:val="19"/>
+              </w:rPr>
+              <w:t>1</w:t>
+            </w:r>
+          </w:p>
+        </w:tc>
+        <w:tc>
+          <w:tcPr>
+            <w:tcW w:type="dxa" w:w="6083"/>
+          </w:tcPr>
+          <w:p>
+            <w:r/>
+            <w:r>
+              <w:rPr>
+                <w:sz w:val="19"/>
+              </w:rPr>
+              <w:t>1 Agent team · 2 Instructions · 3 Skills · 4 Connectors</w:t>
+            </w:r>
+          </w:p>
+        </w:tc>
+        <w:tc>
+          <w:tcPr>
+            <w:tcW w:type="dxa" w:w="2212"/>
+          </w:tcPr>
+          <w:p>
+            <w:r/>
+            <w:r>
+              <w:rPr>
+                <w:sz w:val="19"/>
+              </w:rPr>
+              <w:t>T1 · form the team</w:t>
+            </w:r>
+          </w:p>
+        </w:tc>
+      </w:tr>
+      <w:tr>
+        <w:tc>
+          <w:tcPr>
+            <w:tcW w:type="dxa" w:w="922"/>
+          </w:tcPr>
+          <w:p>
+            <w:r/>
+            <w:r>
+              <w:rPr>
+                <w:sz w:val="19"/>
+              </w:rPr>
+              <w:t>1</w:t>
+            </w:r>
+          </w:p>
+        </w:tc>
+        <w:tc>
+          <w:tcPr>
+            <w:tcW w:type="dxa" w:w="6083"/>
+          </w:tcPr>
+          <w:p>
+            <w:r/>
+            <w:r>
+              <w:rPr>
+                <w:sz w:val="19"/>
+              </w:rPr>
+              <w:t>5 Campaign 1: research to storyboard</w:t>
+            </w:r>
+          </w:p>
+        </w:tc>
+        <w:tc>
+          <w:tcPr>
+            <w:tcW w:type="dxa" w:w="2212"/>
+          </w:tcPr>
+          <w:p>
+            <w:r/>
+            <w:r>
+              <w:rPr>
+                <w:sz w:val="19"/>
+              </w:rPr>
+              <w:t>T1 · Campaign 1</w:t>
+            </w:r>
+          </w:p>
+        </w:tc>
+      </w:tr>
+      <w:tr>
+        <w:tc>
+          <w:tcPr>
+            <w:tcW w:type="dxa" w:w="922"/>
+          </w:tcPr>
+          <w:p>
+            <w:r/>
+            <w:r>
+              <w:rPr>
+                <w:sz w:val="19"/>
+              </w:rPr>
+              <w:t>1</w:t>
+            </w:r>
+          </w:p>
+        </w:tc>
+        <w:tc>
+          <w:tcPr>
+            <w:tcW w:type="dxa" w:w="6083"/>
+          </w:tcPr>
+          <w:p>
+            <w:r/>
+            <w:r>
+              <w:rPr>
+                <w:sz w:val="19"/>
+              </w:rPr>
+              <w:t>6 Personas · 7 Cadence and calendar · 8 Blog article</w:t>
+            </w:r>
+          </w:p>
+        </w:tc>
+        <w:tc>
+          <w:tcPr>
+            <w:tcW w:type="dxa" w:w="2212"/>
+          </w:tcPr>
+          <w:p>
+            <w:r/>
+            <w:r>
+              <w:rPr>
+                <w:sz w:val="19"/>
+              </w:rPr>
+              <w:t>T2 · audience, content</w:t>
+            </w:r>
+          </w:p>
+        </w:tc>
+      </w:tr>
+      <w:tr>
+        <w:tc>
+          <w:tcPr>
+            <w:tcW w:type="dxa" w:w="922"/>
+          </w:tcPr>
+          <w:p>
+            <w:r/>
+            <w:r>
+              <w:rPr>
+                <w:sz w:val="19"/>
+              </w:rPr>
+              <w:t>2</w:t>
+            </w:r>
+          </w:p>
+        </w:tc>
+        <w:tc>
+          <w:tcPr>
+            <w:tcW w:type="dxa" w:w="6083"/>
+          </w:tcPr>
+          <w:p>
+            <w:r/>
+            <w:r>
+              <w:rPr>
+                <w:sz w:val="19"/>
+              </w:rPr>
+              <w:t>9 Lead magnet · 10 Social week · 11 Newsletter + landing page · 12 Video</w:t>
+            </w:r>
+          </w:p>
+        </w:tc>
+        <w:tc>
+          <w:tcPr>
+            <w:tcW w:type="dxa" w:w="2212"/>
+          </w:tcPr>
+          <w:p>
+            <w:r/>
+            <w:r>
+              <w:rPr>
+                <w:sz w:val="19"/>
+              </w:rPr>
+              <w:t>T3 · Campaigns 2–4</w:t>
+            </w:r>
+          </w:p>
+        </w:tc>
+      </w:tr>
+      <w:tr>
+        <w:tc>
+          <w:tcPr>
+            <w:tcW w:type="dxa" w:w="922"/>
+          </w:tcPr>
+          <w:p>
+            <w:r/>
+            <w:r>
+              <w:rPr>
+                <w:sz w:val="19"/>
+              </w:rPr>
+              <w:t>2</w:t>
+            </w:r>
+          </w:p>
+        </w:tc>
+        <w:tc>
+          <w:tcPr>
+            <w:tcW w:type="dxa" w:w="6083"/>
+          </w:tcPr>
+          <w:p>
+            <w:r/>
+            <w:r>
+              <w:rPr>
+                <w:sz w:val="19"/>
+              </w:rPr>
+              <w:t>13 Weekly report · 14 Playbook · 15 Optional demo</w:t>
+            </w:r>
+          </w:p>
+        </w:tc>
+        <w:tc>
+          <w:tcPr>
+            <w:tcW w:type="dxa" w:w="2212"/>
+          </w:tcPr>
+          <w:p>
+            <w:r/>
+            <w:r>
+              <w:rPr>
+                <w:sz w:val="19"/>
+              </w:rPr>
+              <w:t>T4 · Campaign 5</w:t>
+            </w:r>
+          </w:p>
+        </w:tc>
+      </w:tr>
+    </w:tbl>
+    <w:p/>
+    <w:p>
+      <w:r>
+        <w:rPr>
+          <w:i/>
+        </w:rPr>
+        <w:t>Tip: One horizon-studio folder from Lab 1 to Lab 14 — the team keeps what it learns.</w:t>
+      </w:r>
+    </w:p>
+    <w:p>
+      <w:pPr>
+        <w:pStyle w:val="Heading3"/>
+      </w:pPr>
+      <w:r>
+        <w:t>ChatGPT or Codex?</w:t>
+      </w:r>
+    </w:p>
+    <w:p>
+      <w:r>
+        <w:t>Every lab says which to use. The rule: ChatGPT to create and schedule; Codex when the agents work on files.</w:t>
+      </w:r>
+    </w:p>
+    <w:tbl>
+      <w:tblPr>
+        <w:tblStyle w:val="TableGrid"/>
+        <w:tblW w:type="auto" w:w="0"/>
+        <w:jc w:val="center"/>
+        <w:tblLayout w:type="fixed"/>
+        <w:tblLook w:firstColumn="1" w:firstRow="1" w:lastColumn="0" w:lastRow="0" w:noHBand="0" w:noVBand="1" w:val="04A0"/>
+      </w:tblPr>
+      <w:tblGrid>
+        <w:gridCol w:w="2027"/>
+        <w:gridCol w:w="2396"/>
+        <w:gridCol w:w="4792"/>
+      </w:tblGrid>
+      <w:tr>
+        <w:tc>
+          <w:tcPr>
+            <w:tcW w:type="dxa" w:w="2028"/>
+            <w:shd w:val="clear" w:fill="1F6FEB"/>
+          </w:tcPr>
+          <w:p>
+            <w:r/>
+            <w:r>
+              <w:rPr>
+                <w:b/>
+                <w:color w:val="FFFFFF"/>
+                <w:sz w:val="19"/>
+              </w:rPr>
+              <w:t>Use</w:t>
+            </w:r>
+          </w:p>
+        </w:tc>
+        <w:tc>
+          <w:tcPr>
+            <w:tcW w:type="dxa" w:w="2396"/>
+            <w:shd w:val="clear" w:fill="1F6FEB"/>
+          </w:tcPr>
+          <w:p>
+            <w:r/>
+            <w:r>
+              <w:rPr>
+                <w:b/>
+                <w:color w:val="FFFFFF"/>
+                <w:sz w:val="19"/>
+              </w:rPr>
+              <w:t>Labs</w:t>
+            </w:r>
+          </w:p>
+        </w:tc>
+        <w:tc>
+          <w:tcPr>
+            <w:tcW w:type="dxa" w:w="4792"/>
+            <w:shd w:val="clear" w:fill="1F6FEB"/>
+          </w:tcPr>
+          <w:p>
+            <w:r/>
+            <w:r>
+              <w:rPr>
+                <w:b/>
+                <w:color w:val="FFFFFF"/>
+                <w:sz w:val="19"/>
+              </w:rPr>
+              <w:t>What it is for</w:t>
+            </w:r>
+          </w:p>
+        </w:tc>
+      </w:tr>
+      <w:tr>
+        <w:tc>
+          <w:tcPr>
+            <w:tcW w:type="dxa" w:w="2028"/>
+          </w:tcPr>
+          <w:p>
+            <w:r/>
+            <w:r>
+              <w:rPr>
+                <w:sz w:val="19"/>
+              </w:rPr>
+              <w:t>ChatGPT</w:t>
+            </w:r>
+          </w:p>
+        </w:tc>
+        <w:tc>
+          <w:tcPr>
+            <w:tcW w:type="dxa" w:w="2396"/>
+          </w:tcPr>
+          <w:p>
+            <w:r/>
+            <w:r>
+              <w:rPr>
+                <w:sz w:val="19"/>
+              </w:rPr>
+              <w:t>8, 9, 15</w:t>
+            </w:r>
+          </w:p>
+        </w:tc>
+        <w:tc>
+          <w:tcPr>
+            <w:tcW w:type="dxa" w:w="4792"/>
+          </w:tcPr>
+          <w:p>
+            <w:r/>
+            <w:r>
+              <w:rPr>
+                <w:sz w:val="19"/>
+              </w:rPr>
+              <w:t>One person creating or designing.</w:t>
+            </w:r>
+          </w:p>
+        </w:tc>
+      </w:tr>
+      <w:tr>
+        <w:tc>
+          <w:tcPr>
+            <w:tcW w:type="dxa" w:w="2028"/>
+          </w:tcPr>
+          <w:p>
+            <w:r/>
+            <w:r>
+              <w:rPr>
+                <w:sz w:val="19"/>
+              </w:rPr>
+              <w:t>Codex</w:t>
+            </w:r>
+          </w:p>
+        </w:tc>
+        <w:tc>
+          <w:tcPr>
+            <w:tcW w:type="dxa" w:w="2396"/>
+          </w:tcPr>
+          <w:p>
+            <w:r/>
+            <w:r>
+              <w:rPr>
+                <w:sz w:val="19"/>
+              </w:rPr>
+              <w:t>1, 2, 5, 6, 7, 10, 12, 14</w:t>
+            </w:r>
+          </w:p>
+        </w:tc>
+        <w:tc>
+          <w:tcPr>
+            <w:tcW w:type="dxa" w:w="4792"/>
+          </w:tcPr>
+          <w:p>
+            <w:r/>
+            <w:r>
+              <w:rPr>
+                <w:sz w:val="19"/>
+              </w:rPr>
+              <w:t>The team's files: role cards, skills, subagents, scripts, the video.</w:t>
+            </w:r>
+          </w:p>
+        </w:tc>
+      </w:tr>
+      <w:tr>
+        <w:tc>
+          <w:tcPr>
+            <w:tcW w:type="dxa" w:w="2028"/>
+          </w:tcPr>
+          <w:p>
+            <w:r/>
+            <w:r>
+              <w:rPr>
+                <w:sz w:val="19"/>
+              </w:rPr>
+              <w:t>Codex, then ChatGPT</w:t>
+            </w:r>
+          </w:p>
+        </w:tc>
+        <w:tc>
+          <w:tcPr>
+            <w:tcW w:type="dxa" w:w="2396"/>
+          </w:tcPr>
+          <w:p>
+            <w:r/>
+            <w:r>
+              <w:rPr>
+                <w:sz w:val="19"/>
+              </w:rPr>
+              <w:t>3</w:t>
+            </w:r>
+          </w:p>
+        </w:tc>
+        <w:tc>
+          <w:tcPr>
+            <w:tcW w:type="dxa" w:w="4792"/>
+          </w:tcPr>
+          <w:p>
+            <w:r/>
+            <w:r>
+              <w:rPr>
+                <w:sz w:val="19"/>
+              </w:rPr>
+              <w:t>Build in Codex, then share in ChatGPT.</w:t>
+            </w:r>
+          </w:p>
+        </w:tc>
+      </w:tr>
+      <w:tr>
+        <w:tc>
+          <w:tcPr>
+            <w:tcW w:type="dxa" w:w="2028"/>
+          </w:tcPr>
+          <w:p>
+            <w:r/>
+            <w:r>
+              <w:rPr>
+                <w:sz w:val="19"/>
+              </w:rPr>
+              <w:t>ChatGPT, then Codex</w:t>
+            </w:r>
+          </w:p>
+        </w:tc>
+        <w:tc>
+          <w:tcPr>
+            <w:tcW w:type="dxa" w:w="2396"/>
+          </w:tcPr>
+          <w:p>
+            <w:r/>
+            <w:r>
+              <w:rPr>
+                <w:sz w:val="19"/>
+              </w:rPr>
+              <w:t>4</w:t>
+            </w:r>
+          </w:p>
+        </w:tc>
+        <w:tc>
+          <w:tcPr>
+            <w:tcW w:type="dxa" w:w="4792"/>
+          </w:tcPr>
+          <w:p>
+            <w:r/>
+            <w:r>
+              <w:rPr>
+                <w:sz w:val="19"/>
+              </w:rPr>
+              <w:t>Install plugins, then test the agents.</w:t>
+            </w:r>
+          </w:p>
+        </w:tc>
+      </w:tr>
+      <w:tr>
+        <w:tc>
+          <w:tcPr>
+            <w:tcW w:type="dxa" w:w="2028"/>
+          </w:tcPr>
+          <w:p>
+            <w:r/>
+            <w:r>
+              <w:rPr>
+                <w:sz w:val="19"/>
+              </w:rPr>
+              <w:t>Codex, then ChatGPT Work</w:t>
+            </w:r>
+          </w:p>
+        </w:tc>
+        <w:tc>
+          <w:tcPr>
+            <w:tcW w:type="dxa" w:w="2396"/>
+          </w:tcPr>
+          <w:p>
+            <w:r/>
+            <w:r>
+              <w:rPr>
+                <w:sz w:val="19"/>
+              </w:rPr>
+              <w:t>11</w:t>
+            </w:r>
+          </w:p>
+        </w:tc>
+        <w:tc>
+          <w:tcPr>
+            <w:tcW w:type="dxa" w:w="4792"/>
+          </w:tcPr>
+          <w:p>
+            <w:r/>
+            <w:r>
+              <w:rPr>
+                <w:sz w:val="19"/>
+              </w:rPr>
+              <w:t>Build in Codex; Gmail drafts in ChatGPT Work.</w:t>
+            </w:r>
+          </w:p>
+        </w:tc>
+      </w:tr>
+      <w:tr>
+        <w:tc>
+          <w:tcPr>
+            <w:tcW w:type="dxa" w:w="2028"/>
+          </w:tcPr>
+          <w:p>
+            <w:r/>
+            <w:r>
+              <w:rPr>
+                <w:sz w:val="19"/>
+              </w:rPr>
+              <w:t>ChatGPT Work</w:t>
+            </w:r>
+          </w:p>
+        </w:tc>
+        <w:tc>
+          <w:tcPr>
+            <w:tcW w:type="dxa" w:w="2396"/>
+          </w:tcPr>
+          <w:p>
+            <w:r/>
+            <w:r>
+              <w:rPr>
+                <w:sz w:val="19"/>
+              </w:rPr>
+              <w:t>13</w:t>
+            </w:r>
+          </w:p>
+        </w:tc>
+        <w:tc>
+          <w:tcPr>
+            <w:tcW w:type="dxa" w:w="4792"/>
+          </w:tcPr>
+          <w:p>
+            <w:r/>
+            <w:r>
+              <w:rPr>
+                <w:sz w:val="19"/>
+              </w:rPr>
+              <w:t>Scheduled tasks and plugins.</w:t>
+            </w:r>
+          </w:p>
+        </w:tc>
+      </w:tr>
+    </w:tbl>
+    <w:p/>
+    <w:p>
+      <w:r>
+        <w:rPr>
+          <w:i/>
+        </w:rPr>
+        <w:t>Tip: Both work on the same horizon-studio folder, so whatever one makes, the other can open.</w:t>
+      </w:r>
+    </w:p>
+    <w:p>
+      <w:pPr>
+        <w:pStyle w:val="Heading3"/>
+      </w:pPr>
+      <w:r>
+        <w:t>Lesson Plan (9:00 AM – 6:00 PM)</w:t>
+      </w:r>
+    </w:p>
+    <w:p>
+      <w:r>
+        <w:t>Tea breaks 10 min, lunch 45 min. Full timings and slide numbers are in the Lesson Plan.</w:t>
+      </w:r>
+    </w:p>
+    <w:tbl>
+      <w:tblPr>
+        <w:tblStyle w:val="TableGrid"/>
+        <w:tblW w:type="auto" w:w="0"/>
+        <w:jc w:val="center"/>
+        <w:tblLayout w:type="fixed"/>
+        <w:tblLook w:firstColumn="1" w:firstRow="1" w:lastColumn="0" w:lastRow="0" w:noHBand="0" w:noVBand="1" w:val="04A0"/>
+      </w:tblPr>
+      <w:tblGrid>
+        <w:gridCol w:w="1474"/>
+        <w:gridCol w:w="3870"/>
+        <w:gridCol w:w="3870"/>
+      </w:tblGrid>
+      <w:tr>
+        <w:tc>
+          <w:tcPr>
+            <w:tcW w:type="dxa" w:w="1475"/>
+            <w:shd w:val="clear" w:fill="1F6FEB"/>
+          </w:tcPr>
+          <w:p>
+            <w:r/>
+            <w:r>
+              <w:rPr>
+                <w:b/>
+                <w:color w:val="FFFFFF"/>
+                <w:sz w:val="19"/>
+              </w:rPr>
+              <w:t>Block</w:t>
+            </w:r>
+          </w:p>
+        </w:tc>
+        <w:tc>
+          <w:tcPr>
+            <w:tcW w:type="dxa" w:w="3871"/>
+            <w:shd w:val="clear" w:fill="1F6FEB"/>
+          </w:tcPr>
+          <w:p>
+            <w:r/>
+            <w:r>
+              <w:rPr>
+                <w:b/>
+                <w:color w:val="FFFFFF"/>
+                <w:sz w:val="19"/>
+              </w:rPr>
+              <w:t>Day 1 — Form the Team</w:t>
+            </w:r>
+          </w:p>
+        </w:tc>
+        <w:tc>
+          <w:tcPr>
+            <w:tcW w:type="dxa" w:w="3871"/>
+            <w:shd w:val="clear" w:fill="1F6FEB"/>
+          </w:tcPr>
+          <w:p>
+            <w:r/>
+            <w:r>
+              <w:rPr>
+                <w:b/>
+                <w:color w:val="FFFFFF"/>
+                <w:sz w:val="19"/>
+              </w:rPr>
+              <w:t>Day 2 — Run the Campaigns</w:t>
+            </w:r>
+          </w:p>
+        </w:tc>
+      </w:tr>
+      <w:tr>
+        <w:tc>
+          <w:tcPr>
+            <w:tcW w:type="dxa" w:w="1475"/>
+          </w:tcPr>
+          <w:p>
+            <w:r/>
+            <w:r>
+              <w:rPr>
+                <w:sz w:val="19"/>
+              </w:rPr>
+              <w:t>Morning 1</w:t>
+            </w:r>
+          </w:p>
+        </w:tc>
+        <w:tc>
+          <w:tcPr>
+            <w:tcW w:type="dxa" w:w="3871"/>
+          </w:tcPr>
+          <w:p>
+            <w:r/>
+            <w:r>
+              <w:rPr>
+                <w:sz w:val="19"/>
+              </w:rPr>
+              <w:t>9:00–10:30  Welcome · Topic 1 · Lab 1</w:t>
+            </w:r>
+          </w:p>
+        </w:tc>
+        <w:tc>
+          <w:tcPr>
+            <w:tcW w:type="dxa" w:w="3871"/>
+          </w:tcPr>
+          <w:p>
+            <w:r/>
+            <w:r>
+              <w:rPr>
+                <w:sz w:val="19"/>
+              </w:rPr>
+              <w:t>9:00–10:40  Topic 3 · Labs 9–10</w:t>
+            </w:r>
+          </w:p>
+        </w:tc>
+      </w:tr>
+      <w:tr>
+        <w:tc>
+          <w:tcPr>
+            <w:tcW w:type="dxa" w:w="1475"/>
+          </w:tcPr>
+          <w:p>
+            <w:r/>
+            <w:r>
+              <w:rPr>
+                <w:sz w:val="19"/>
+              </w:rPr>
+              <w:t>Morning 2</w:t>
+            </w:r>
+          </w:p>
+        </w:tc>
+        <w:tc>
+          <w:tcPr>
+            <w:tcW w:type="dxa" w:w="3871"/>
+          </w:tcPr>
+          <w:p>
+            <w:r/>
+            <w:r>
+              <w:rPr>
+                <w:sz w:val="19"/>
+              </w:rPr>
+              <w:t>10:40–12:40  Labs 2–3</w:t>
+            </w:r>
+          </w:p>
+        </w:tc>
+        <w:tc>
+          <w:tcPr>
+            <w:tcW w:type="dxa" w:w="3871"/>
+          </w:tcPr>
+          <w:p>
+            <w:r/>
+            <w:r>
+              <w:rPr>
+                <w:sz w:val="19"/>
+              </w:rPr>
+              <w:t>10:50–12:35  Labs 11–12 · recap</w:t>
+            </w:r>
+          </w:p>
+        </w:tc>
+      </w:tr>
+      <w:tr>
+        <w:tc>
+          <w:tcPr>
+            <w:tcW w:type="dxa" w:w="1475"/>
+          </w:tcPr>
+          <w:p>
+            <w:r/>
+            <w:r>
+              <w:rPr>
+                <w:sz w:val="19"/>
+              </w:rPr>
+              <w:t>Afternoon 1</w:t>
+            </w:r>
+          </w:p>
+        </w:tc>
+        <w:tc>
+          <w:tcPr>
+            <w:tcW w:type="dxa" w:w="3871"/>
+          </w:tcPr>
+          <w:p>
+            <w:r/>
+            <w:r>
+              <w:rPr>
+                <w:sz w:val="19"/>
+              </w:rPr>
+              <w:t>13:25–15:20  Labs 4–5</w:t>
+            </w:r>
+          </w:p>
+        </w:tc>
+        <w:tc>
+          <w:tcPr>
+            <w:tcW w:type="dxa" w:w="3871"/>
+          </w:tcPr>
+          <w:p>
+            <w:r/>
+            <w:r>
+              <w:rPr>
+                <w:sz w:val="19"/>
+              </w:rPr>
+              <w:t>13:20–15:00  Topic 4 · Labs 13–14</w:t>
+            </w:r>
+          </w:p>
+        </w:tc>
+      </w:tr>
+      <w:tr>
+        <w:tc>
+          <w:tcPr>
+            <w:tcW w:type="dxa" w:w="1475"/>
+          </w:tcPr>
+          <w:p>
+            <w:r/>
+            <w:r>
+              <w:rPr>
+                <w:sz w:val="19"/>
+              </w:rPr>
+              <w:t>Afternoon 2</w:t>
+            </w:r>
+          </w:p>
+        </w:tc>
+        <w:tc>
+          <w:tcPr>
+            <w:tcW w:type="dxa" w:w="3871"/>
+          </w:tcPr>
+          <w:p>
+            <w:r/>
+            <w:r>
+              <w:rPr>
+                <w:sz w:val="19"/>
+              </w:rPr>
+              <w:t>15:30–18:00  Topic 2 · Labs 6–8 · review</w:t>
+            </w:r>
+          </w:p>
+        </w:tc>
+        <w:tc>
+          <w:tcPr>
+            <w:tcW w:type="dxa" w:w="3871"/>
+          </w:tcPr>
+          <w:p>
+            <w:r/>
+            <w:r>
+              <w:rPr>
+                <w:sz w:val="19"/>
+              </w:rPr>
+              <w:t>15:10–16:00 Demo · summary · 16:00–18:00 Assessment</w:t>
+            </w:r>
+          </w:p>
+        </w:tc>
+      </w:tr>
+    </w:tbl>
+    <w:p/>
+    <w:p>
+      <w:r>
+        <w:rPr>
+          <w:i/>
+        </w:rPr>
+        <w:t>Tip: Day 2 assessment: Written Assessment 4:00–5:00 PM, Practical Performance 5:00–6:00 PM.</w:t>
       </w:r>
     </w:p>
     <w:p>
@@ -3403,7 +4415,7 @@
         <w:pStyle w:val="ListNumber"/>
         <w:numPr>
           <w:ilvl w:val="0"/>
-          <w:numId w:val="10"/>
+          <w:numId w:val="11"/>
         </w:numPr>
       </w:pPr>
       <w:r>
@@ -4089,7 +5101,7 @@
         <w:pStyle w:val="ListNumber"/>
         <w:numPr>
           <w:ilvl w:val="0"/>
-          <w:numId w:val="11"/>
+          <w:numId w:val="12"/>
         </w:numPr>
       </w:pPr>
       <w:r>
@@ -5172,1018 +6184,6 @@
           <w:i/>
         </w:rPr>
         <w:t>Tip: Every external post, email and video passes one gate: a person approves the exact version.</w:t>
-      </w:r>
-    </w:p>
-    <w:p>
-      <w:pPr>
-        <w:pStyle w:val="Heading3"/>
-      </w:pPr>
-      <w:r>
-        <w:t>Course Outline</w:t>
-      </w:r>
-    </w:p>
-    <w:p>
-      <w:r>
-        <w:t>Four topics over two days. Day 1 forms the team; Day 2 runs its campaigns.</w:t>
-      </w:r>
-    </w:p>
-    <w:p>
-      <w:pPr>
-        <w:pStyle w:val="ListNumber"/>
-        <w:numPr>
-          <w:ilvl w:val="0"/>
-          <w:numId w:val="12"/>
-        </w:numPr>
-      </w:pPr>
-      <w:r>
-        <w:rPr>
-          <w:b/>
-        </w:rPr>
-        <w:t>T1 · Ideation and Storyboarding</w:t>
-      </w:r>
-      <w:r>
-        <w:rPr>
-          <w:b w:val="0"/>
-        </w:rPr>
-        <w:t xml:space="preserve"> — The studio, the team's instructions, skills and connectors; Campaign 1. Labs 1–5.</w:t>
-      </w:r>
-    </w:p>
-    <w:p>
-      <w:pPr>
-        <w:pStyle w:val="ListNumber"/>
-      </w:pPr>
-      <w:r>
-        <w:rPr>
-          <w:b/>
-        </w:rPr>
-        <w:t>T2 · Audience and Requirements</w:t>
-      </w:r>
-      <w:r>
-        <w:rPr>
-          <w:b w:val="0"/>
-        </w:rPr>
-        <w:t xml:space="preserve"> — Personas from evidence; cadence and calendar; the first blog article. Labs 6–8.</w:t>
-      </w:r>
-    </w:p>
-    <w:p>
-      <w:pPr>
-        <w:pStyle w:val="ListNumber"/>
-      </w:pPr>
-      <w:r>
-        <w:rPr>
-          <w:b/>
-        </w:rPr>
-        <w:t>T3 · Creation and Coordination</w:t>
-      </w:r>
-      <w:r>
-        <w:rPr>
-          <w:b w:val="0"/>
-        </w:rPr>
-        <w:t xml:space="preserve"> — Lead magnet, social week, newsletter + landing page, video — behind a human gate. Labs 9–12.</w:t>
-      </w:r>
-    </w:p>
-    <w:p>
-      <w:pPr>
-        <w:pStyle w:val="ListNumber"/>
-      </w:pPr>
-      <w:r>
-        <w:rPr>
-          <w:b/>
-        </w:rPr>
-        <w:t>T4 · Distribution and Responsible AI</w:t>
-      </w:r>
-      <w:r>
-        <w:rPr>
-          <w:b w:val="0"/>
-        </w:rPr>
-        <w:t xml:space="preserve"> — The weekly report on a schedule; the playbook; optional demo. Labs 13–15.</w:t>
-      </w:r>
-    </w:p>
-    <w:p>
-      <w:pPr>
-        <w:pStyle w:val="Heading3"/>
-      </w:pPr>
-      <w:r>
-        <w:t>Lab Materials</w:t>
-      </w:r>
-    </w:p>
-    <w:p>
-      <w:r>
-        <w:t>Fifteen labs, each in its own folder with a README, prompts (MD and PDF), assets, an evidence checklist and, where useful, a solution.</w:t>
-      </w:r>
-    </w:p>
-    <w:tbl>
-      <w:tblPr>
-        <w:tblStyle w:val="TableGrid"/>
-        <w:tblW w:type="auto" w:w="0"/>
-        <w:jc w:val="center"/>
-        <w:tblLayout w:type="fixed"/>
-        <w:tblLook w:firstColumn="1" w:firstRow="1" w:lastColumn="0" w:lastRow="0" w:noHBand="0" w:noVBand="1" w:val="04A0"/>
-      </w:tblPr>
-      <w:tblGrid>
-        <w:gridCol w:w="921"/>
-        <w:gridCol w:w="6082"/>
-        <w:gridCol w:w="2211"/>
-      </w:tblGrid>
-      <w:tr>
-        <w:tc>
-          <w:tcPr>
-            <w:tcW w:type="dxa" w:w="922"/>
-            <w:shd w:val="clear" w:fill="1F6FEB"/>
-          </w:tcPr>
-          <w:p>
-            <w:r/>
-            <w:r>
-              <w:rPr>
-                <w:b/>
-                <w:color w:val="FFFFFF"/>
-                <w:sz w:val="19"/>
-              </w:rPr>
-              <w:t>Day</w:t>
-            </w:r>
-          </w:p>
-        </w:tc>
-        <w:tc>
-          <w:tcPr>
-            <w:tcW w:type="dxa" w:w="6083"/>
-            <w:shd w:val="clear" w:fill="1F6FEB"/>
-          </w:tcPr>
-          <w:p>
-            <w:r/>
-            <w:r>
-              <w:rPr>
-                <w:b/>
-                <w:color w:val="FFFFFF"/>
-                <w:sz w:val="19"/>
-              </w:rPr>
-              <w:t>Labs</w:t>
-            </w:r>
-          </w:p>
-        </w:tc>
-        <w:tc>
-          <w:tcPr>
-            <w:tcW w:type="dxa" w:w="2212"/>
-            <w:shd w:val="clear" w:fill="1F6FEB"/>
-          </w:tcPr>
-          <w:p>
-            <w:r/>
-            <w:r>
-              <w:rPr>
-                <w:b/>
-                <w:color w:val="FFFFFF"/>
-                <w:sz w:val="19"/>
-              </w:rPr>
-              <w:t>Topic</w:t>
-            </w:r>
-          </w:p>
-        </w:tc>
-      </w:tr>
-      <w:tr>
-        <w:tc>
-          <w:tcPr>
-            <w:tcW w:type="dxa" w:w="922"/>
-          </w:tcPr>
-          <w:p>
-            <w:r/>
-            <w:r>
-              <w:rPr>
-                <w:sz w:val="19"/>
-              </w:rPr>
-              <w:t>1</w:t>
-            </w:r>
-          </w:p>
-        </w:tc>
-        <w:tc>
-          <w:tcPr>
-            <w:tcW w:type="dxa" w:w="6083"/>
-          </w:tcPr>
-          <w:p>
-            <w:r/>
-            <w:r>
-              <w:rPr>
-                <w:sz w:val="19"/>
-              </w:rPr>
-              <w:t>1 Agent team · 2 Instructions · 3 Skills · 4 Connectors</w:t>
-            </w:r>
-          </w:p>
-        </w:tc>
-        <w:tc>
-          <w:tcPr>
-            <w:tcW w:type="dxa" w:w="2212"/>
-          </w:tcPr>
-          <w:p>
-            <w:r/>
-            <w:r>
-              <w:rPr>
-                <w:sz w:val="19"/>
-              </w:rPr>
-              <w:t>T1 · form the team</w:t>
-            </w:r>
-          </w:p>
-        </w:tc>
-      </w:tr>
-      <w:tr>
-        <w:tc>
-          <w:tcPr>
-            <w:tcW w:type="dxa" w:w="922"/>
-          </w:tcPr>
-          <w:p>
-            <w:r/>
-            <w:r>
-              <w:rPr>
-                <w:sz w:val="19"/>
-              </w:rPr>
-              <w:t>1</w:t>
-            </w:r>
-          </w:p>
-        </w:tc>
-        <w:tc>
-          <w:tcPr>
-            <w:tcW w:type="dxa" w:w="6083"/>
-          </w:tcPr>
-          <w:p>
-            <w:r/>
-            <w:r>
-              <w:rPr>
-                <w:sz w:val="19"/>
-              </w:rPr>
-              <w:t>5 Campaign 1: research to storyboard</w:t>
-            </w:r>
-          </w:p>
-        </w:tc>
-        <w:tc>
-          <w:tcPr>
-            <w:tcW w:type="dxa" w:w="2212"/>
-          </w:tcPr>
-          <w:p>
-            <w:r/>
-            <w:r>
-              <w:rPr>
-                <w:sz w:val="19"/>
-              </w:rPr>
-              <w:t>T1 · Campaign 1</w:t>
-            </w:r>
-          </w:p>
-        </w:tc>
-      </w:tr>
-      <w:tr>
-        <w:tc>
-          <w:tcPr>
-            <w:tcW w:type="dxa" w:w="922"/>
-          </w:tcPr>
-          <w:p>
-            <w:r/>
-            <w:r>
-              <w:rPr>
-                <w:sz w:val="19"/>
-              </w:rPr>
-              <w:t>1</w:t>
-            </w:r>
-          </w:p>
-        </w:tc>
-        <w:tc>
-          <w:tcPr>
-            <w:tcW w:type="dxa" w:w="6083"/>
-          </w:tcPr>
-          <w:p>
-            <w:r/>
-            <w:r>
-              <w:rPr>
-                <w:sz w:val="19"/>
-              </w:rPr>
-              <w:t>6 Personas · 7 Cadence and calendar · 8 Blog article</w:t>
-            </w:r>
-          </w:p>
-        </w:tc>
-        <w:tc>
-          <w:tcPr>
-            <w:tcW w:type="dxa" w:w="2212"/>
-          </w:tcPr>
-          <w:p>
-            <w:r/>
-            <w:r>
-              <w:rPr>
-                <w:sz w:val="19"/>
-              </w:rPr>
-              <w:t>T2 · audience, content</w:t>
-            </w:r>
-          </w:p>
-        </w:tc>
-      </w:tr>
-      <w:tr>
-        <w:tc>
-          <w:tcPr>
-            <w:tcW w:type="dxa" w:w="922"/>
-          </w:tcPr>
-          <w:p>
-            <w:r/>
-            <w:r>
-              <w:rPr>
-                <w:sz w:val="19"/>
-              </w:rPr>
-              <w:t>2</w:t>
-            </w:r>
-          </w:p>
-        </w:tc>
-        <w:tc>
-          <w:tcPr>
-            <w:tcW w:type="dxa" w:w="6083"/>
-          </w:tcPr>
-          <w:p>
-            <w:r/>
-            <w:r>
-              <w:rPr>
-                <w:sz w:val="19"/>
-              </w:rPr>
-              <w:t>9 Lead magnet · 10 Social week · 11 Newsletter + landing page · 12 Video</w:t>
-            </w:r>
-          </w:p>
-        </w:tc>
-        <w:tc>
-          <w:tcPr>
-            <w:tcW w:type="dxa" w:w="2212"/>
-          </w:tcPr>
-          <w:p>
-            <w:r/>
-            <w:r>
-              <w:rPr>
-                <w:sz w:val="19"/>
-              </w:rPr>
-              <w:t>T3 · Campaigns 2–4</w:t>
-            </w:r>
-          </w:p>
-        </w:tc>
-      </w:tr>
-      <w:tr>
-        <w:tc>
-          <w:tcPr>
-            <w:tcW w:type="dxa" w:w="922"/>
-          </w:tcPr>
-          <w:p>
-            <w:r/>
-            <w:r>
-              <w:rPr>
-                <w:sz w:val="19"/>
-              </w:rPr>
-              <w:t>2</w:t>
-            </w:r>
-          </w:p>
-        </w:tc>
-        <w:tc>
-          <w:tcPr>
-            <w:tcW w:type="dxa" w:w="6083"/>
-          </w:tcPr>
-          <w:p>
-            <w:r/>
-            <w:r>
-              <w:rPr>
-                <w:sz w:val="19"/>
-              </w:rPr>
-              <w:t>13 Weekly report · 14 Playbook · 15 Optional demo</w:t>
-            </w:r>
-          </w:p>
-        </w:tc>
-        <w:tc>
-          <w:tcPr>
-            <w:tcW w:type="dxa" w:w="2212"/>
-          </w:tcPr>
-          <w:p>
-            <w:r/>
-            <w:r>
-              <w:rPr>
-                <w:sz w:val="19"/>
-              </w:rPr>
-              <w:t>T4 · Campaign 5</w:t>
-            </w:r>
-          </w:p>
-        </w:tc>
-      </w:tr>
-    </w:tbl>
-    <w:p/>
-    <w:p>
-      <w:r>
-        <w:rPr>
-          <w:i/>
-        </w:rPr>
-        <w:t>Tip: One horizon-studio folder from Lab 1 to Lab 14 — the team keeps what it learns.</w:t>
-      </w:r>
-    </w:p>
-    <w:p>
-      <w:pPr>
-        <w:pStyle w:val="Heading3"/>
-      </w:pPr>
-      <w:r>
-        <w:t>ChatGPT or Codex?</w:t>
-      </w:r>
-    </w:p>
-    <w:p>
-      <w:r>
-        <w:t>Every lab says which to use. The rule: ChatGPT to create and schedule; Codex when the agents work on files.</w:t>
-      </w:r>
-    </w:p>
-    <w:tbl>
-      <w:tblPr>
-        <w:tblStyle w:val="TableGrid"/>
-        <w:tblW w:type="auto" w:w="0"/>
-        <w:jc w:val="center"/>
-        <w:tblLayout w:type="fixed"/>
-        <w:tblLook w:firstColumn="1" w:firstRow="1" w:lastColumn="0" w:lastRow="0" w:noHBand="0" w:noVBand="1" w:val="04A0"/>
-      </w:tblPr>
-      <w:tblGrid>
-        <w:gridCol w:w="2027"/>
-        <w:gridCol w:w="2396"/>
-        <w:gridCol w:w="4792"/>
-      </w:tblGrid>
-      <w:tr>
-        <w:tc>
-          <w:tcPr>
-            <w:tcW w:type="dxa" w:w="2028"/>
-            <w:shd w:val="clear" w:fill="1F6FEB"/>
-          </w:tcPr>
-          <w:p>
-            <w:r/>
-            <w:r>
-              <w:rPr>
-                <w:b/>
-                <w:color w:val="FFFFFF"/>
-                <w:sz w:val="19"/>
-              </w:rPr>
-              <w:t>Use</w:t>
-            </w:r>
-          </w:p>
-        </w:tc>
-        <w:tc>
-          <w:tcPr>
-            <w:tcW w:type="dxa" w:w="2396"/>
-            <w:shd w:val="clear" w:fill="1F6FEB"/>
-          </w:tcPr>
-          <w:p>
-            <w:r/>
-            <w:r>
-              <w:rPr>
-                <w:b/>
-                <w:color w:val="FFFFFF"/>
-                <w:sz w:val="19"/>
-              </w:rPr>
-              <w:t>Labs</w:t>
-            </w:r>
-          </w:p>
-        </w:tc>
-        <w:tc>
-          <w:tcPr>
-            <w:tcW w:type="dxa" w:w="4792"/>
-            <w:shd w:val="clear" w:fill="1F6FEB"/>
-          </w:tcPr>
-          <w:p>
-            <w:r/>
-            <w:r>
-              <w:rPr>
-                <w:b/>
-                <w:color w:val="FFFFFF"/>
-                <w:sz w:val="19"/>
-              </w:rPr>
-              <w:t>What it is for</w:t>
-            </w:r>
-          </w:p>
-        </w:tc>
-      </w:tr>
-      <w:tr>
-        <w:tc>
-          <w:tcPr>
-            <w:tcW w:type="dxa" w:w="2028"/>
-          </w:tcPr>
-          <w:p>
-            <w:r/>
-            <w:r>
-              <w:rPr>
-                <w:sz w:val="19"/>
-              </w:rPr>
-              <w:t>ChatGPT</w:t>
-            </w:r>
-          </w:p>
-        </w:tc>
-        <w:tc>
-          <w:tcPr>
-            <w:tcW w:type="dxa" w:w="2396"/>
-          </w:tcPr>
-          <w:p>
-            <w:r/>
-            <w:r>
-              <w:rPr>
-                <w:sz w:val="19"/>
-              </w:rPr>
-              <w:t>8, 9, 15</w:t>
-            </w:r>
-          </w:p>
-        </w:tc>
-        <w:tc>
-          <w:tcPr>
-            <w:tcW w:type="dxa" w:w="4792"/>
-          </w:tcPr>
-          <w:p>
-            <w:r/>
-            <w:r>
-              <w:rPr>
-                <w:sz w:val="19"/>
-              </w:rPr>
-              <w:t>One person creating or designing.</w:t>
-            </w:r>
-          </w:p>
-        </w:tc>
-      </w:tr>
-      <w:tr>
-        <w:tc>
-          <w:tcPr>
-            <w:tcW w:type="dxa" w:w="2028"/>
-          </w:tcPr>
-          <w:p>
-            <w:r/>
-            <w:r>
-              <w:rPr>
-                <w:sz w:val="19"/>
-              </w:rPr>
-              <w:t>Codex</w:t>
-            </w:r>
-          </w:p>
-        </w:tc>
-        <w:tc>
-          <w:tcPr>
-            <w:tcW w:type="dxa" w:w="2396"/>
-          </w:tcPr>
-          <w:p>
-            <w:r/>
-            <w:r>
-              <w:rPr>
-                <w:sz w:val="19"/>
-              </w:rPr>
-              <w:t>1, 2, 5, 6, 7, 10, 12, 14</w:t>
-            </w:r>
-          </w:p>
-        </w:tc>
-        <w:tc>
-          <w:tcPr>
-            <w:tcW w:type="dxa" w:w="4792"/>
-          </w:tcPr>
-          <w:p>
-            <w:r/>
-            <w:r>
-              <w:rPr>
-                <w:sz w:val="19"/>
-              </w:rPr>
-              <w:t>The team's files: role cards, skills, subagents, scripts, the video.</w:t>
-            </w:r>
-          </w:p>
-        </w:tc>
-      </w:tr>
-      <w:tr>
-        <w:tc>
-          <w:tcPr>
-            <w:tcW w:type="dxa" w:w="2028"/>
-          </w:tcPr>
-          <w:p>
-            <w:r/>
-            <w:r>
-              <w:rPr>
-                <w:sz w:val="19"/>
-              </w:rPr>
-              <w:t>Codex, then ChatGPT</w:t>
-            </w:r>
-          </w:p>
-        </w:tc>
-        <w:tc>
-          <w:tcPr>
-            <w:tcW w:type="dxa" w:w="2396"/>
-          </w:tcPr>
-          <w:p>
-            <w:r/>
-            <w:r>
-              <w:rPr>
-                <w:sz w:val="19"/>
-              </w:rPr>
-              <w:t>3</w:t>
-            </w:r>
-          </w:p>
-        </w:tc>
-        <w:tc>
-          <w:tcPr>
-            <w:tcW w:type="dxa" w:w="4792"/>
-          </w:tcPr>
-          <w:p>
-            <w:r/>
-            <w:r>
-              <w:rPr>
-                <w:sz w:val="19"/>
-              </w:rPr>
-              <w:t>Build in Codex, then share in ChatGPT.</w:t>
-            </w:r>
-          </w:p>
-        </w:tc>
-      </w:tr>
-      <w:tr>
-        <w:tc>
-          <w:tcPr>
-            <w:tcW w:type="dxa" w:w="2028"/>
-          </w:tcPr>
-          <w:p>
-            <w:r/>
-            <w:r>
-              <w:rPr>
-                <w:sz w:val="19"/>
-              </w:rPr>
-              <w:t>ChatGPT, then Codex</w:t>
-            </w:r>
-          </w:p>
-        </w:tc>
-        <w:tc>
-          <w:tcPr>
-            <w:tcW w:type="dxa" w:w="2396"/>
-          </w:tcPr>
-          <w:p>
-            <w:r/>
-            <w:r>
-              <w:rPr>
-                <w:sz w:val="19"/>
-              </w:rPr>
-              <w:t>4</w:t>
-            </w:r>
-          </w:p>
-        </w:tc>
-        <w:tc>
-          <w:tcPr>
-            <w:tcW w:type="dxa" w:w="4792"/>
-          </w:tcPr>
-          <w:p>
-            <w:r/>
-            <w:r>
-              <w:rPr>
-                <w:sz w:val="19"/>
-              </w:rPr>
-              <w:t>Install plugins, then test the agents.</w:t>
-            </w:r>
-          </w:p>
-        </w:tc>
-      </w:tr>
-      <w:tr>
-        <w:tc>
-          <w:tcPr>
-            <w:tcW w:type="dxa" w:w="2028"/>
-          </w:tcPr>
-          <w:p>
-            <w:r/>
-            <w:r>
-              <w:rPr>
-                <w:sz w:val="19"/>
-              </w:rPr>
-              <w:t>Codex, then ChatGPT Work</w:t>
-            </w:r>
-          </w:p>
-        </w:tc>
-        <w:tc>
-          <w:tcPr>
-            <w:tcW w:type="dxa" w:w="2396"/>
-          </w:tcPr>
-          <w:p>
-            <w:r/>
-            <w:r>
-              <w:rPr>
-                <w:sz w:val="19"/>
-              </w:rPr>
-              <w:t>11</w:t>
-            </w:r>
-          </w:p>
-        </w:tc>
-        <w:tc>
-          <w:tcPr>
-            <w:tcW w:type="dxa" w:w="4792"/>
-          </w:tcPr>
-          <w:p>
-            <w:r/>
-            <w:r>
-              <w:rPr>
-                <w:sz w:val="19"/>
-              </w:rPr>
-              <w:t>Build in Codex; Gmail drafts in ChatGPT Work.</w:t>
-            </w:r>
-          </w:p>
-        </w:tc>
-      </w:tr>
-      <w:tr>
-        <w:tc>
-          <w:tcPr>
-            <w:tcW w:type="dxa" w:w="2028"/>
-          </w:tcPr>
-          <w:p>
-            <w:r/>
-            <w:r>
-              <w:rPr>
-                <w:sz w:val="19"/>
-              </w:rPr>
-              <w:t>ChatGPT Work</w:t>
-            </w:r>
-          </w:p>
-        </w:tc>
-        <w:tc>
-          <w:tcPr>
-            <w:tcW w:type="dxa" w:w="2396"/>
-          </w:tcPr>
-          <w:p>
-            <w:r/>
-            <w:r>
-              <w:rPr>
-                <w:sz w:val="19"/>
-              </w:rPr>
-              <w:t>13</w:t>
-            </w:r>
-          </w:p>
-        </w:tc>
-        <w:tc>
-          <w:tcPr>
-            <w:tcW w:type="dxa" w:w="4792"/>
-          </w:tcPr>
-          <w:p>
-            <w:r/>
-            <w:r>
-              <w:rPr>
-                <w:sz w:val="19"/>
-              </w:rPr>
-              <w:t>Scheduled tasks and plugins.</w:t>
-            </w:r>
-          </w:p>
-        </w:tc>
-      </w:tr>
-    </w:tbl>
-    <w:p/>
-    <w:p>
-      <w:r>
-        <w:rPr>
-          <w:i/>
-        </w:rPr>
-        <w:t>Tip: Both work on the same horizon-studio folder, so whatever one makes, the other can open.</w:t>
-      </w:r>
-    </w:p>
-    <w:p>
-      <w:pPr>
-        <w:pStyle w:val="Heading3"/>
-      </w:pPr>
-      <w:r>
-        <w:t>Lesson Plan (9:00 AM – 6:00 PM)</w:t>
-      </w:r>
-    </w:p>
-    <w:p>
-      <w:r>
-        <w:t>Tea breaks 10 min, lunch 45 min. Full timings and slide numbers are in the Lesson Plan.</w:t>
-      </w:r>
-    </w:p>
-    <w:tbl>
-      <w:tblPr>
-        <w:tblStyle w:val="TableGrid"/>
-        <w:tblW w:type="auto" w:w="0"/>
-        <w:jc w:val="center"/>
-        <w:tblLayout w:type="fixed"/>
-        <w:tblLook w:firstColumn="1" w:firstRow="1" w:lastColumn="0" w:lastRow="0" w:noHBand="0" w:noVBand="1" w:val="04A0"/>
-      </w:tblPr>
-      <w:tblGrid>
-        <w:gridCol w:w="1474"/>
-        <w:gridCol w:w="3870"/>
-        <w:gridCol w:w="3870"/>
-      </w:tblGrid>
-      <w:tr>
-        <w:tc>
-          <w:tcPr>
-            <w:tcW w:type="dxa" w:w="1475"/>
-            <w:shd w:val="clear" w:fill="1F6FEB"/>
-          </w:tcPr>
-          <w:p>
-            <w:r/>
-            <w:r>
-              <w:rPr>
-                <w:b/>
-                <w:color w:val="FFFFFF"/>
-                <w:sz w:val="19"/>
-              </w:rPr>
-              <w:t>Block</w:t>
-            </w:r>
-          </w:p>
-        </w:tc>
-        <w:tc>
-          <w:tcPr>
-            <w:tcW w:type="dxa" w:w="3871"/>
-            <w:shd w:val="clear" w:fill="1F6FEB"/>
-          </w:tcPr>
-          <w:p>
-            <w:r/>
-            <w:r>
-              <w:rPr>
-                <w:b/>
-                <w:color w:val="FFFFFF"/>
-                <w:sz w:val="19"/>
-              </w:rPr>
-              <w:t>Day 1 — Form the Team</w:t>
-            </w:r>
-          </w:p>
-        </w:tc>
-        <w:tc>
-          <w:tcPr>
-            <w:tcW w:type="dxa" w:w="3871"/>
-            <w:shd w:val="clear" w:fill="1F6FEB"/>
-          </w:tcPr>
-          <w:p>
-            <w:r/>
-            <w:r>
-              <w:rPr>
-                <w:b/>
-                <w:color w:val="FFFFFF"/>
-                <w:sz w:val="19"/>
-              </w:rPr>
-              <w:t>Day 2 — Run the Campaigns</w:t>
-            </w:r>
-          </w:p>
-        </w:tc>
-      </w:tr>
-      <w:tr>
-        <w:tc>
-          <w:tcPr>
-            <w:tcW w:type="dxa" w:w="1475"/>
-          </w:tcPr>
-          <w:p>
-            <w:r/>
-            <w:r>
-              <w:rPr>
-                <w:sz w:val="19"/>
-              </w:rPr>
-              <w:t>Morning 1</w:t>
-            </w:r>
-          </w:p>
-        </w:tc>
-        <w:tc>
-          <w:tcPr>
-            <w:tcW w:type="dxa" w:w="3871"/>
-          </w:tcPr>
-          <w:p>
-            <w:r/>
-            <w:r>
-              <w:rPr>
-                <w:sz w:val="19"/>
-              </w:rPr>
-              <w:t>9:00–10:30  Welcome · Topic 1 · Lab 1</w:t>
-            </w:r>
-          </w:p>
-        </w:tc>
-        <w:tc>
-          <w:tcPr>
-            <w:tcW w:type="dxa" w:w="3871"/>
-          </w:tcPr>
-          <w:p>
-            <w:r/>
-            <w:r>
-              <w:rPr>
-                <w:sz w:val="19"/>
-              </w:rPr>
-              <w:t>9:00–10:40  Topic 3 · Labs 9–10</w:t>
-            </w:r>
-          </w:p>
-        </w:tc>
-      </w:tr>
-      <w:tr>
-        <w:tc>
-          <w:tcPr>
-            <w:tcW w:type="dxa" w:w="1475"/>
-          </w:tcPr>
-          <w:p>
-            <w:r/>
-            <w:r>
-              <w:rPr>
-                <w:sz w:val="19"/>
-              </w:rPr>
-              <w:t>Morning 2</w:t>
-            </w:r>
-          </w:p>
-        </w:tc>
-        <w:tc>
-          <w:tcPr>
-            <w:tcW w:type="dxa" w:w="3871"/>
-          </w:tcPr>
-          <w:p>
-            <w:r/>
-            <w:r>
-              <w:rPr>
-                <w:sz w:val="19"/>
-              </w:rPr>
-              <w:t>10:40–12:40  Labs 2–3</w:t>
-            </w:r>
-          </w:p>
-        </w:tc>
-        <w:tc>
-          <w:tcPr>
-            <w:tcW w:type="dxa" w:w="3871"/>
-          </w:tcPr>
-          <w:p>
-            <w:r/>
-            <w:r>
-              <w:rPr>
-                <w:sz w:val="19"/>
-              </w:rPr>
-              <w:t>10:50–12:35  Labs 11–12 · recap</w:t>
-            </w:r>
-          </w:p>
-        </w:tc>
-      </w:tr>
-      <w:tr>
-        <w:tc>
-          <w:tcPr>
-            <w:tcW w:type="dxa" w:w="1475"/>
-          </w:tcPr>
-          <w:p>
-            <w:r/>
-            <w:r>
-              <w:rPr>
-                <w:sz w:val="19"/>
-              </w:rPr>
-              <w:t>Afternoon 1</w:t>
-            </w:r>
-          </w:p>
-        </w:tc>
-        <w:tc>
-          <w:tcPr>
-            <w:tcW w:type="dxa" w:w="3871"/>
-          </w:tcPr>
-          <w:p>
-            <w:r/>
-            <w:r>
-              <w:rPr>
-                <w:sz w:val="19"/>
-              </w:rPr>
-              <w:t>13:25–15:20  Labs 4–5</w:t>
-            </w:r>
-          </w:p>
-        </w:tc>
-        <w:tc>
-          <w:tcPr>
-            <w:tcW w:type="dxa" w:w="3871"/>
-          </w:tcPr>
-          <w:p>
-            <w:r/>
-            <w:r>
-              <w:rPr>
-                <w:sz w:val="19"/>
-              </w:rPr>
-              <w:t>13:20–15:00  Topic 4 · Labs 13–14</w:t>
-            </w:r>
-          </w:p>
-        </w:tc>
-      </w:tr>
-      <w:tr>
-        <w:tc>
-          <w:tcPr>
-            <w:tcW w:type="dxa" w:w="1475"/>
-          </w:tcPr>
-          <w:p>
-            <w:r/>
-            <w:r>
-              <w:rPr>
-                <w:sz w:val="19"/>
-              </w:rPr>
-              <w:t>Afternoon 2</w:t>
-            </w:r>
-          </w:p>
-        </w:tc>
-        <w:tc>
-          <w:tcPr>
-            <w:tcW w:type="dxa" w:w="3871"/>
-          </w:tcPr>
-          <w:p>
-            <w:r/>
-            <w:r>
-              <w:rPr>
-                <w:sz w:val="19"/>
-              </w:rPr>
-              <w:t>15:30–18:00  Topic 2 · Labs 6–8 · review</w:t>
-            </w:r>
-          </w:p>
-        </w:tc>
-        <w:tc>
-          <w:tcPr>
-            <w:tcW w:type="dxa" w:w="3871"/>
-          </w:tcPr>
-          <w:p>
-            <w:r/>
-            <w:r>
-              <w:rPr>
-                <w:sz w:val="19"/>
-              </w:rPr>
-              <w:t>15:10–16:00 Demo · summary · 16:00–18:00 Assessment</w:t>
-            </w:r>
-          </w:p>
-        </w:tc>
-      </w:tr>
-    </w:tbl>
-    <w:p/>
-    <w:p>
-      <w:r>
-        <w:rPr>
-          <w:i/>
-        </w:rPr>
-        <w:t>Tip: Day 2 assessment: Written Assessment 4:00–5:00 PM, Practical Performance 5:00–6:00 PM.</w:t>
       </w:r>
     </w:p>
     <w:p>

</xml_diff>

<commit_message>
docs: overview, scenario and team slides open Topic 1
Co-Authored-By: Claude Opus 5.5 <noreply@anthropic.com>
</commit_message>
<xml_diff>
--- a/courseware_chatgpt/LG-Multi AI Agents Workflow for Content Creation - ChatGPT-v3.5.docx
+++ b/courseware_chatgpt/LG-Multi AI Agents Workflow for Content Creation - ChatGPT-v3.5.docx
@@ -920,15 +920,33 @@
         <w:tabs>
           <w:tab w:pos="9648" w:val="right" w:leader="dot"/>
         </w:tabs>
+        <w:spacing w:after="60"/>
+        <w:ind w:left="0"/>
+      </w:pPr>
+      <w:r>
+        <w:rPr>
+          <w:b/>
+          <w:sz w:val="21"/>
+        </w:rPr>
+        <w:t>Topic 1 — Multi-AI-Agent Content Ideation and Digital Storyboarding</w:t>
+        <w:tab/>
+        <w:t>9</w:t>
+      </w:r>
+    </w:p>
+    <w:p>
+      <w:pPr>
+        <w:tabs>
+          <w:tab w:pos="9648" w:val="right" w:leader="dot"/>
+        </w:tabs>
         <w:spacing w:after="20"/>
-        <w:ind w:left="720"/>
+        <w:ind w:left="360"/>
       </w:pPr>
       <w:r>
         <w:rPr>
           <w:b w:val="0"/>
           <w:sz w:val="19"/>
         </w:rPr>
-        <w:t>ChatGPT, ChatGPT Work and Codex</w:t>
+        <w:t>Key ideas for Lab 1</w:t>
         <w:tab/>
         <w:t>9</w:t>
       </w:r>
@@ -946,7 +964,7 @@
           <w:b w:val="0"/>
           <w:sz w:val="19"/>
         </w:rPr>
-        <w:t>Which Plan Has What</w:t>
+        <w:t>ChatGPT, ChatGPT Work and Codex</w:t>
         <w:tab/>
         <w:t>9</w:t>
       </w:r>
@@ -964,7 +982,7 @@
           <w:b w:val="0"/>
           <w:sz w:val="19"/>
         </w:rPr>
-        <w:t>A Brief History of AI, 2023–2026</w:t>
+        <w:t>Which Plan Has What</w:t>
         <w:tab/>
         <w:t>9</w:t>
       </w:r>
@@ -982,7 +1000,7 @@
           <w:b w:val="0"/>
           <w:sz w:val="19"/>
         </w:rPr>
-        <w:t>What Is a Harness?</w:t>
+        <w:t>A Brief History of AI, 2023–2026</w:t>
         <w:tab/>
         <w:t>10</w:t>
       </w:r>
@@ -1000,7 +1018,7 @@
           <w:b w:val="0"/>
           <w:sz w:val="19"/>
         </w:rPr>
-        <w:t>The Agentic Loop</w:t>
+        <w:t>What Is a Harness?</w:t>
         <w:tab/>
         <w:t>10</w:t>
       </w:r>
@@ -1018,7 +1036,7 @@
           <w:b w:val="0"/>
           <w:sz w:val="19"/>
         </w:rPr>
-        <w:t>Why the Loop Matters</w:t>
+        <w:t>The Agentic Loop</w:t>
         <w:tab/>
         <w:t>10</w:t>
       </w:r>
@@ -1036,7 +1054,7 @@
           <w:b w:val="0"/>
           <w:sz w:val="19"/>
         </w:rPr>
-        <w:t>Agentic AI vs AI Agents</w:t>
+        <w:t>Why the Loop Matters</w:t>
         <w:tab/>
         <w:t>10</w:t>
       </w:r>
@@ -1054,7 +1072,7 @@
           <w:b w:val="0"/>
           <w:sz w:val="19"/>
         </w:rPr>
-        <w:t>What Is an Agent Made Of?</w:t>
+        <w:t>Agentic AI vs AI Agents</w:t>
         <w:tab/>
         <w:t>11</w:t>
       </w:r>
@@ -1072,7 +1090,7 @@
           <w:b w:val="0"/>
           <w:sz w:val="19"/>
         </w:rPr>
-        <w:t>Build a Marketing Team, Then Run Campaigns</w:t>
+        <w:t>What Is an Agent Made Of?</w:t>
         <w:tab/>
         <w:t>11</w:t>
       </w:r>
@@ -1090,7 +1108,7 @@
           <w:b w:val="0"/>
           <w:sz w:val="19"/>
         </w:rPr>
-        <w:t>Meet Horizon Wealth Planning</w:t>
+        <w:t>Build a Marketing Team, Then Run Campaigns</w:t>
         <w:tab/>
         <w:t>11</w:t>
       </w:r>
@@ -1108,7 +1126,7 @@
           <w:b w:val="0"/>
           <w:sz w:val="19"/>
         </w:rPr>
-        <w:t>Your AI Marketing Team</w:t>
+        <w:t>Meet Horizon Wealth Planning</w:t>
         <w:tab/>
         <w:t>12</w:t>
       </w:r>
@@ -1126,7 +1144,7 @@
           <w:b w:val="0"/>
           <w:sz w:val="19"/>
         </w:rPr>
-        <w:t>Who Does What</w:t>
+        <w:t>Your AI Marketing Team</w:t>
         <w:tab/>
         <w:t>12</w:t>
       </w:r>
@@ -1144,9 +1162,441 @@
           <w:b w:val="0"/>
           <w:sz w:val="19"/>
         </w:rPr>
+        <w:t>Who Does What</w:t>
+        <w:tab/>
+        <w:t>12</w:t>
+      </w:r>
+    </w:p>
+    <w:p>
+      <w:pPr>
+        <w:tabs>
+          <w:tab w:pos="9648" w:val="right" w:leader="dot"/>
+        </w:tabs>
+        <w:spacing w:after="20"/>
+        <w:ind w:left="720"/>
+      </w:pPr>
+      <w:r>
+        <w:rPr>
+          <w:b w:val="0"/>
+          <w:sz w:val="19"/>
+        </w:rPr>
         <w:t>The Tools for This Edition</w:t>
         <w:tab/>
         <w:t>13</w:t>
+      </w:r>
+    </w:p>
+    <w:p>
+      <w:pPr>
+        <w:tabs>
+          <w:tab w:pos="9648" w:val="right" w:leader="dot"/>
+        </w:tabs>
+        <w:spacing w:after="20"/>
+        <w:ind w:left="720"/>
+      </w:pPr>
+      <w:r>
+        <w:rPr>
+          <w:b w:val="0"/>
+          <w:sz w:val="19"/>
+        </w:rPr>
+        <w:t>Why a Team of Agents?</w:t>
+        <w:tab/>
+        <w:t>13</w:t>
+      </w:r>
+    </w:p>
+    <w:p>
+      <w:pPr>
+        <w:tabs>
+          <w:tab w:pos="9648" w:val="right" w:leader="dot"/>
+        </w:tabs>
+        <w:spacing w:after="20"/>
+        <w:ind w:left="720"/>
+      </w:pPr>
+      <w:r>
+        <w:rPr>
+          <w:b w:val="0"/>
+          <w:sz w:val="19"/>
+        </w:rPr>
+        <w:t>Get the Tools Ready</w:t>
+        <w:tab/>
+        <w:t>13</w:t>
+      </w:r>
+    </w:p>
+    <w:p>
+      <w:pPr>
+        <w:tabs>
+          <w:tab w:pos="9648" w:val="right" w:leader="dot"/>
+        </w:tabs>
+        <w:spacing w:after="20"/>
+        <w:ind w:left="720"/>
+      </w:pPr>
+      <w:r>
+        <w:rPr>
+          <w:b w:val="0"/>
+          <w:sz w:val="19"/>
+        </w:rPr>
+        <w:t>A Home for the Team</w:t>
+        <w:tab/>
+        <w:t>14</w:t>
+      </w:r>
+    </w:p>
+    <w:p>
+      <w:pPr>
+        <w:tabs>
+          <w:tab w:pos="9648" w:val="right" w:leader="dot"/>
+        </w:tabs>
+        <w:spacing w:after="20"/>
+        <w:ind w:left="360"/>
+      </w:pPr>
+      <w:r>
+        <w:rPr>
+          <w:b w:val="0"/>
+          <w:sz w:val="19"/>
+        </w:rPr>
+        <w:t>Lab 1 — Build Your Marketing Agent Team</w:t>
+        <w:tab/>
+        <w:t>14</w:t>
+      </w:r>
+    </w:p>
+    <w:p>
+      <w:pPr>
+        <w:tabs>
+          <w:tab w:pos="9648" w:val="right" w:leader="dot"/>
+        </w:tabs>
+        <w:spacing w:after="20"/>
+        <w:ind w:left="360"/>
+      </w:pPr>
+      <w:r>
+        <w:rPr>
+          <w:b w:val="0"/>
+          <w:sz w:val="19"/>
+        </w:rPr>
+        <w:t>Key ideas for Lab 2</w:t>
+        <w:tab/>
+        <w:t>16</w:t>
+      </w:r>
+    </w:p>
+    <w:p>
+      <w:pPr>
+        <w:tabs>
+          <w:tab w:pos="9648" w:val="right" w:leader="dot"/>
+        </w:tabs>
+        <w:spacing w:after="20"/>
+        <w:ind w:left="720"/>
+      </w:pPr>
+      <w:r>
+        <w:rPr>
+          <w:b w:val="0"/>
+          <w:sz w:val="19"/>
+        </w:rPr>
+        <w:t>Anatomy of an Agent</w:t>
+        <w:tab/>
+        <w:t>16</w:t>
+      </w:r>
+    </w:p>
+    <w:p>
+      <w:pPr>
+        <w:tabs>
+          <w:tab w:pos="9648" w:val="right" w:leader="dot"/>
+        </w:tabs>
+        <w:spacing w:after="20"/>
+        <w:ind w:left="720"/>
+      </w:pPr>
+      <w:r>
+        <w:rPr>
+          <w:b w:val="0"/>
+          <w:sz w:val="19"/>
+        </w:rPr>
+        <w:t>Good Agent Instructions</w:t>
+        <w:tab/>
+        <w:t>16</w:t>
+      </w:r>
+    </w:p>
+    <w:p>
+      <w:pPr>
+        <w:tabs>
+          <w:tab w:pos="9648" w:val="right" w:leader="dot"/>
+        </w:tabs>
+        <w:spacing w:after="20"/>
+        <w:ind w:left="360"/>
+      </w:pPr>
+      <w:r>
+        <w:rPr>
+          <w:b w:val="0"/>
+          <w:sz w:val="19"/>
+        </w:rPr>
+        <w:t>Lab 2 — Form the Team: Instructions for Each Agent</w:t>
+        <w:tab/>
+        <w:t>17</w:t>
+      </w:r>
+    </w:p>
+    <w:p>
+      <w:pPr>
+        <w:tabs>
+          <w:tab w:pos="9648" w:val="right" w:leader="dot"/>
+        </w:tabs>
+        <w:spacing w:after="20"/>
+        <w:ind w:left="360"/>
+      </w:pPr>
+      <w:r>
+        <w:rPr>
+          <w:b w:val="0"/>
+          <w:sz w:val="19"/>
+        </w:rPr>
+        <w:t>Key ideas for Lab 3</w:t>
+        <w:tab/>
+        <w:t>18</w:t>
+      </w:r>
+    </w:p>
+    <w:p>
+      <w:pPr>
+        <w:tabs>
+          <w:tab w:pos="9648" w:val="right" w:leader="dot"/>
+        </w:tabs>
+        <w:spacing w:after="20"/>
+        <w:ind w:left="720"/>
+      </w:pPr>
+      <w:r>
+        <w:rPr>
+          <w:b w:val="0"/>
+          <w:sz w:val="19"/>
+        </w:rPr>
+        <w:t>Twenty Skills, Owned by Role</w:t>
+        <w:tab/>
+        <w:t>18</w:t>
+      </w:r>
+    </w:p>
+    <w:p>
+      <w:pPr>
+        <w:tabs>
+          <w:tab w:pos="9648" w:val="right" w:leader="dot"/>
+        </w:tabs>
+        <w:spacing w:after="20"/>
+        <w:ind w:left="720"/>
+      </w:pPr>
+      <w:r>
+        <w:rPr>
+          <w:b w:val="0"/>
+          <w:sz w:val="19"/>
+        </w:rPr>
+        <w:t>Anatomy of a Skill</w:t>
+        <w:tab/>
+        <w:t>18</w:t>
+      </w:r>
+    </w:p>
+    <w:p>
+      <w:pPr>
+        <w:tabs>
+          <w:tab w:pos="9648" w:val="right" w:leader="dot"/>
+        </w:tabs>
+        <w:spacing w:after="20"/>
+        <w:ind w:left="360"/>
+      </w:pPr>
+      <w:r>
+        <w:rPr>
+          <w:b w:val="0"/>
+          <w:sz w:val="19"/>
+        </w:rPr>
+        <w:t>Lab 3 — Give Each Agent Its Skills</w:t>
+        <w:tab/>
+        <w:t>19</w:t>
+      </w:r>
+    </w:p>
+    <w:p>
+      <w:pPr>
+        <w:tabs>
+          <w:tab w:pos="9648" w:val="right" w:leader="dot"/>
+        </w:tabs>
+        <w:spacing w:after="20"/>
+        <w:ind w:left="360"/>
+      </w:pPr>
+      <w:r>
+        <w:rPr>
+          <w:b w:val="0"/>
+          <w:sz w:val="19"/>
+        </w:rPr>
+        <w:t>Key ideas for Lab 4</w:t>
+        <w:tab/>
+        <w:t>20</w:t>
+      </w:r>
+    </w:p>
+    <w:p>
+      <w:pPr>
+        <w:tabs>
+          <w:tab w:pos="9648" w:val="right" w:leader="dot"/>
+        </w:tabs>
+        <w:spacing w:after="20"/>
+        <w:ind w:left="720"/>
+      </w:pPr>
+      <w:r>
+        <w:rPr>
+          <w:b w:val="0"/>
+          <w:sz w:val="19"/>
+        </w:rPr>
+        <w:t>Plugins for Each Agent</w:t>
+        <w:tab/>
+        <w:t>20</w:t>
+      </w:r>
+    </w:p>
+    <w:p>
+      <w:pPr>
+        <w:tabs>
+          <w:tab w:pos="9648" w:val="right" w:leader="dot"/>
+        </w:tabs>
+        <w:spacing w:after="20"/>
+        <w:ind w:left="720"/>
+      </w:pPr>
+      <w:r>
+        <w:rPr>
+          <w:b w:val="0"/>
+          <w:sz w:val="19"/>
+        </w:rPr>
+        <w:t>Least Privilege</w:t>
+        <w:tab/>
+        <w:t>21</w:t>
+      </w:r>
+    </w:p>
+    <w:p>
+      <w:pPr>
+        <w:tabs>
+          <w:tab w:pos="9648" w:val="right" w:leader="dot"/>
+        </w:tabs>
+        <w:spacing w:after="20"/>
+        <w:ind w:left="360"/>
+      </w:pPr>
+      <w:r>
+        <w:rPr>
+          <w:b w:val="0"/>
+          <w:sz w:val="19"/>
+        </w:rPr>
+        <w:t>Lab 4 — Install the Plugins Each Agent Needs</w:t>
+        <w:tab/>
+        <w:t>21</w:t>
+      </w:r>
+    </w:p>
+    <w:p>
+      <w:pPr>
+        <w:tabs>
+          <w:tab w:pos="9648" w:val="right" w:leader="dot"/>
+        </w:tabs>
+        <w:spacing w:after="20"/>
+        <w:ind w:left="360"/>
+      </w:pPr>
+      <w:r>
+        <w:rPr>
+          <w:b w:val="0"/>
+          <w:sz w:val="19"/>
+        </w:rPr>
+        <w:t>Key ideas for Lab 5</w:t>
+        <w:tab/>
+        <w:t>22</w:t>
+      </w:r>
+    </w:p>
+    <w:p>
+      <w:pPr>
+        <w:tabs>
+          <w:tab w:pos="9648" w:val="right" w:leader="dot"/>
+        </w:tabs>
+        <w:spacing w:after="20"/>
+        <w:ind w:left="720"/>
+      </w:pPr>
+      <w:r>
+        <w:rPr>
+          <w:b w:val="0"/>
+          <w:sz w:val="19"/>
+        </w:rPr>
+        <w:t>How the Team Runs a Campaign</w:t>
+        <w:tab/>
+        <w:t>22</w:t>
+      </w:r>
+    </w:p>
+    <w:p>
+      <w:pPr>
+        <w:tabs>
+          <w:tab w:pos="9648" w:val="right" w:leader="dot"/>
+        </w:tabs>
+        <w:spacing w:after="20"/>
+        <w:ind w:left="720"/>
+      </w:pPr>
+      <w:r>
+        <w:rPr>
+          <w:b w:val="0"/>
+          <w:sz w:val="19"/>
+        </w:rPr>
+        <w:t>The Five-Beat Storyboard</w:t>
+        <w:tab/>
+        <w:t>22</w:t>
+      </w:r>
+    </w:p>
+    <w:p>
+      <w:pPr>
+        <w:tabs>
+          <w:tab w:pos="9648" w:val="right" w:leader="dot"/>
+        </w:tabs>
+        <w:spacing w:after="20"/>
+        <w:ind w:left="720"/>
+      </w:pPr>
+      <w:r>
+        <w:rPr>
+          <w:b w:val="0"/>
+          <w:sz w:val="19"/>
+        </w:rPr>
+        <w:t>Financial Content Is Regulated</w:t>
+        <w:tab/>
+        <w:t>22</w:t>
+      </w:r>
+    </w:p>
+    <w:p>
+      <w:pPr>
+        <w:tabs>
+          <w:tab w:pos="9648" w:val="right" w:leader="dot"/>
+        </w:tabs>
+        <w:spacing w:after="20"/>
+        <w:ind w:left="360"/>
+      </w:pPr>
+      <w:r>
+        <w:rPr>
+          <w:b w:val="0"/>
+          <w:sz w:val="19"/>
+        </w:rPr>
+        <w:t>Lab 5 — Campaign 1: Research to Storyboard, with Subagents</w:t>
+        <w:tab/>
+        <w:t>23</w:t>
+      </w:r>
+    </w:p>
+    <w:p>
+      <w:pPr>
+        <w:tabs>
+          <w:tab w:pos="9648" w:val="right" w:leader="dot"/>
+        </w:tabs>
+        <w:spacing w:after="20"/>
+        <w:ind w:left="360"/>
+      </w:pPr>
+      <w:r>
+        <w:rPr>
+          <w:b w:val="0"/>
+          <w:sz w:val="19"/>
+        </w:rPr>
+        <w:t>Topic 1 recap</w:t>
+        <w:tab/>
+        <w:t>25</w:t>
+      </w:r>
+    </w:p>
+    <w:p>
+      <w:pPr>
+        <w:tabs>
+          <w:tab w:pos="9648" w:val="right" w:leader="dot"/>
+        </w:tabs>
+        <w:spacing w:after="20"/>
+        <w:ind w:left="720"/>
+      </w:pPr>
+      <w:r>
+        <w:rPr>
+          <w:b w:val="0"/>
+          <w:sz w:val="19"/>
+        </w:rPr>
+        <w:t>Where You Are Now</w:t>
+        <w:tab/>
+        <w:t>25</w:t>
       </w:r>
     </w:p>
     <w:p>
@@ -1162,9 +1612,9 @@
           <w:b/>
           <w:sz w:val="21"/>
         </w:rPr>
-        <w:t>Topic 1 — Multi-AI-Agent Content Ideation and Digital Storyboarding</w:t>
+        <w:t>Topic 2 — Audience Research and Content Requirement Analysis</w:t>
         <w:tab/>
-        <w:t>13</w:t>
+        <w:t>25</w:t>
       </w:r>
     </w:p>
     <w:p>
@@ -1180,9 +1630,9 @@
           <w:b w:val="0"/>
           <w:sz w:val="19"/>
         </w:rPr>
-        <w:t>Key ideas for Lab 1</w:t>
+        <w:t>Key ideas for Lab 6</w:t>
         <w:tab/>
-        <w:t>13</w:t>
+        <w:t>25</w:t>
       </w:r>
     </w:p>
     <w:p>
@@ -1198,9 +1648,9 @@
           <w:b w:val="0"/>
           <w:sz w:val="19"/>
         </w:rPr>
-        <w:t>Why a Team of Agents?</w:t>
+        <w:t>Evidence Before Personas</w:t>
         <w:tab/>
-        <w:t>13</w:t>
+        <w:t>25</w:t>
       </w:r>
     </w:p>
     <w:p>
@@ -1216,9 +1666,45 @@
           <w:b w:val="0"/>
           <w:sz w:val="19"/>
         </w:rPr>
-        <w:t>Get the Tools Ready</w:t>
+        <w:t>Observed, Inferred or Low Confidence?</w:t>
         <w:tab/>
-        <w:t>14</w:t>
+        <w:t>25</w:t>
+      </w:r>
+    </w:p>
+    <w:p>
+      <w:pPr>
+        <w:tabs>
+          <w:tab w:pos="9648" w:val="right" w:leader="dot"/>
+        </w:tabs>
+        <w:spacing w:after="20"/>
+        <w:ind w:left="360"/>
+      </w:pPr>
+      <w:r>
+        <w:rPr>
+          <w:b w:val="0"/>
+          <w:sz w:val="19"/>
+        </w:rPr>
+        <w:t>Lab 6 — Growth Analyst: Personas from Evidence</w:t>
+        <w:tab/>
+        <w:t>26</w:t>
+      </w:r>
+    </w:p>
+    <w:p>
+      <w:pPr>
+        <w:tabs>
+          <w:tab w:pos="9648" w:val="right" w:leader="dot"/>
+        </w:tabs>
+        <w:spacing w:after="20"/>
+        <w:ind w:left="360"/>
+      </w:pPr>
+      <w:r>
+        <w:rPr>
+          <w:b w:val="0"/>
+          <w:sz w:val="19"/>
+        </w:rPr>
+        <w:t>Key ideas for Lab 7</w:t>
+        <w:tab/>
+        <w:t>27</w:t>
       </w:r>
     </w:p>
     <w:p>
@@ -1234,9 +1720,9 @@
           <w:b w:val="0"/>
           <w:sz w:val="19"/>
         </w:rPr>
-        <w:t>A Home for the Team</w:t>
+        <w:t>Finding the Right Frequency</w:t>
         <w:tab/>
-        <w:t>14</w:t>
+        <w:t>27</w:t>
       </w:r>
     </w:p>
     <w:p>
@@ -1252,9 +1738,9 @@
           <w:b w:val="0"/>
           <w:sz w:val="19"/>
         </w:rPr>
-        <w:t>Lab 1 — Build Your Marketing Agent Team</w:t>
+        <w:t>Lab 7 — Growth Analyst and Strategist: Cadence and Calendar</w:t>
         <w:tab/>
-        <w:t>14</w:t>
+        <w:t>27</w:t>
       </w:r>
     </w:p>
     <w:p>
@@ -1270,9 +1756,9 @@
           <w:b w:val="0"/>
           <w:sz w:val="19"/>
         </w:rPr>
-        <w:t>Key ideas for Lab 2</w:t>
+        <w:t>Key ideas for Lab 8</w:t>
         <w:tab/>
-        <w:t>16</w:t>
+        <w:t>29</w:t>
       </w:r>
     </w:p>
     <w:p>
@@ -1288,9 +1774,45 @@
           <w:b w:val="0"/>
           <w:sz w:val="19"/>
         </w:rPr>
-        <w:t>Anatomy of an Agent</w:t>
+        <w:t>From Storyboard to Content</w:t>
         <w:tab/>
-        <w:t>16</w:t>
+        <w:t>29</w:t>
+      </w:r>
+    </w:p>
+    <w:p>
+      <w:pPr>
+        <w:tabs>
+          <w:tab w:pos="9648" w:val="right" w:leader="dot"/>
+        </w:tabs>
+        <w:spacing w:after="20"/>
+        <w:ind w:left="360"/>
+      </w:pPr>
+      <w:r>
+        <w:rPr>
+          <w:b w:val="0"/>
+          <w:sz w:val="19"/>
+        </w:rPr>
+        <w:t>Lab 8 — Content Creator: A Quick Blog Article</w:t>
+        <w:tab/>
+        <w:t>29</w:t>
+      </w:r>
+    </w:p>
+    <w:p>
+      <w:pPr>
+        <w:tabs>
+          <w:tab w:pos="9648" w:val="right" w:leader="dot"/>
+        </w:tabs>
+        <w:spacing w:after="20"/>
+        <w:ind w:left="360"/>
+      </w:pPr>
+      <w:r>
+        <w:rPr>
+          <w:b w:val="0"/>
+          <w:sz w:val="19"/>
+        </w:rPr>
+        <w:t>Topic 2 recap</w:t>
+        <w:tab/>
+        <w:t>30</w:t>
       </w:r>
     </w:p>
     <w:p>
@@ -1306,9 +1828,27 @@
           <w:b w:val="0"/>
           <w:sz w:val="19"/>
         </w:rPr>
-        <w:t>Good Agent Instructions</w:t>
+        <w:t>Day 1: The Team Is Ready</w:t>
         <w:tab/>
-        <w:t>17</w:t>
+        <w:t>30</w:t>
+      </w:r>
+    </w:p>
+    <w:p>
+      <w:pPr>
+        <w:tabs>
+          <w:tab w:pos="9648" w:val="right" w:leader="dot"/>
+        </w:tabs>
+        <w:spacing w:after="60"/>
+        <w:ind w:left="0"/>
+      </w:pPr>
+      <w:r>
+        <w:rPr>
+          <w:b/>
+          <w:sz w:val="21"/>
+        </w:rPr>
+        <w:t>Topic 3 — Multi-Channel Content Creation and Agent Workflow Coordination</w:t>
+        <w:tab/>
+        <w:t>30</w:t>
       </w:r>
     </w:p>
     <w:p>
@@ -1324,9 +1864,27 @@
           <w:b w:val="0"/>
           <w:sz w:val="19"/>
         </w:rPr>
-        <w:t>Lab 2 — Form the Team: Instructions for Each Agent</w:t>
+        <w:t>Key ideas for Lab 9</w:t>
         <w:tab/>
-        <w:t>17</w:t>
+        <w:t>31</w:t>
+      </w:r>
+    </w:p>
+    <w:p>
+      <w:pPr>
+        <w:tabs>
+          <w:tab w:pos="9648" w:val="right" w:leader="dot"/>
+        </w:tabs>
+        <w:spacing w:after="20"/>
+        <w:ind w:left="720"/>
+      </w:pPr>
+      <w:r>
+        <w:rPr>
+          <w:b w:val="0"/>
+          <w:sz w:val="19"/>
+        </w:rPr>
+        <w:t>Content That Earns a Sign-up</w:t>
+        <w:tab/>
+        <w:t>31</w:t>
       </w:r>
     </w:p>
     <w:p>
@@ -1342,9 +1900,27 @@
           <w:b w:val="0"/>
           <w:sz w:val="19"/>
         </w:rPr>
-        <w:t>Key ideas for Lab 3</w:t>
+        <w:t>Lab 9 — The Lead Magnet: a Checklist and Its Welcome Emails</w:t>
         <w:tab/>
-        <w:t>18</w:t>
+        <w:t>31</w:t>
+      </w:r>
+    </w:p>
+    <w:p>
+      <w:pPr>
+        <w:tabs>
+          <w:tab w:pos="9648" w:val="right" w:leader="dot"/>
+        </w:tabs>
+        <w:spacing w:after="20"/>
+        <w:ind w:left="360"/>
+      </w:pPr>
+      <w:r>
+        <w:rPr>
+          <w:b w:val="0"/>
+          <w:sz w:val="19"/>
+        </w:rPr>
+        <w:t>Key ideas for Lab 10</w:t>
+        <w:tab/>
+        <w:t>32</w:t>
       </w:r>
     </w:p>
     <w:p>
@@ -1360,9 +1936,9 @@
           <w:b w:val="0"/>
           <w:sz w:val="19"/>
         </w:rPr>
-        <w:t>Twenty Skills, Owned by Role</w:t>
+        <w:t>Subagents in Codex</w:t>
         <w:tab/>
-        <w:t>18</w:t>
+        <w:t>32</w:t>
       </w:r>
     </w:p>
     <w:p>
@@ -1378,9 +1954,81 @@
           <w:b w:val="0"/>
           <w:sz w:val="19"/>
         </w:rPr>
-        <w:t>Anatomy of a Skill</w:t>
+        <w:t>Parallel, Then Review</w:t>
         <w:tab/>
-        <w:t>19</w:t>
+        <w:t>33</w:t>
+      </w:r>
+    </w:p>
+    <w:p>
+      <w:pPr>
+        <w:tabs>
+          <w:tab w:pos="9648" w:val="right" w:leader="dot"/>
+        </w:tabs>
+        <w:spacing w:after="20"/>
+        <w:ind w:left="720"/>
+      </w:pPr>
+      <w:r>
+        <w:rPr>
+          <w:b w:val="0"/>
+          <w:sz w:val="19"/>
+        </w:rPr>
+        <w:t>Human in the Loop, Enforced</w:t>
+        <w:tab/>
+        <w:t>33</w:t>
+      </w:r>
+    </w:p>
+    <w:p>
+      <w:pPr>
+        <w:tabs>
+          <w:tab w:pos="9648" w:val="right" w:leader="dot"/>
+        </w:tabs>
+        <w:spacing w:after="20"/>
+        <w:ind w:left="720"/>
+      </w:pPr>
+      <w:r>
+        <w:rPr>
+          <w:b w:val="0"/>
+          <w:sz w:val="19"/>
+        </w:rPr>
+        <w:t>The Hook That Holds the Gate</w:t>
+        <w:tab/>
+        <w:t>33</w:t>
+      </w:r>
+    </w:p>
+    <w:p>
+      <w:pPr>
+        <w:tabs>
+          <w:tab w:pos="9648" w:val="right" w:leader="dot"/>
+        </w:tabs>
+        <w:spacing w:after="20"/>
+        <w:ind w:left="720"/>
+      </w:pPr>
+      <w:r>
+        <w:rPr>
+          <w:b w:val="0"/>
+          <w:sz w:val="19"/>
+        </w:rPr>
+        <w:t>The Publishing APIs</w:t>
+        <w:tab/>
+        <w:t>33</w:t>
+      </w:r>
+    </w:p>
+    <w:p>
+      <w:pPr>
+        <w:tabs>
+          <w:tab w:pos="9648" w:val="right" w:leader="dot"/>
+        </w:tabs>
+        <w:spacing w:after="20"/>
+        <w:ind w:left="720"/>
+      </w:pPr>
+      <w:r>
+        <w:rPr>
+          <w:b w:val="0"/>
+          <w:sz w:val="19"/>
+        </w:rPr>
+        <w:t>Campaign 2: A Social Media Week</w:t>
+        <w:tab/>
+        <w:t>34</w:t>
       </w:r>
     </w:p>
     <w:p>
@@ -1396,9 +2044,9 @@
           <w:b w:val="0"/>
           <w:sz w:val="19"/>
         </w:rPr>
-        <w:t>Lab 3 — Give Each Agent Its Skills</w:t>
+        <w:t>Lab 10 — Campaign 2: Social Media Posts (Demo)</w:t>
         <w:tab/>
-        <w:t>19</w:t>
+        <w:t>34</w:t>
       </w:r>
     </w:p>
     <w:p>
@@ -1414,9 +2062,9 @@
           <w:b w:val="0"/>
           <w:sz w:val="19"/>
         </w:rPr>
-        <w:t>Key ideas for Lab 4</w:t>
+        <w:t>Key ideas for Lab 11</w:t>
         <w:tab/>
-        <w:t>20</w:t>
+        <w:t>35</w:t>
       </w:r>
     </w:p>
     <w:p>
@@ -1432,9 +2080,9 @@
           <w:b w:val="0"/>
           <w:sz w:val="19"/>
         </w:rPr>
-        <w:t>Plugins for Each Agent</w:t>
+        <w:t>Campaign 3: Newsletter + Landing Page</w:t>
         <w:tab/>
-        <w:t>20</w:t>
+        <w:t>35</w:t>
       </w:r>
     </w:p>
     <w:p>
@@ -1450,9 +2098,9 @@
           <w:b w:val="0"/>
           <w:sz w:val="19"/>
         </w:rPr>
-        <w:t>Least Privilege</w:t>
+        <w:t>Consent Decides Who Gets Mail</w:t>
         <w:tab/>
-        <w:t>21</w:t>
+        <w:t>36</w:t>
       </w:r>
     </w:p>
     <w:p>
@@ -1468,9 +2116,9 @@
           <w:b w:val="0"/>
           <w:sz w:val="19"/>
         </w:rPr>
-        <w:t>Lab 4 — Install the Plugins Each Agent Needs</w:t>
+        <w:t>Lab 11 — Campaign 3: Newsletter and a Landing Page</w:t>
         <w:tab/>
-        <w:t>21</w:t>
+        <w:t>36</w:t>
       </w:r>
     </w:p>
     <w:p>
@@ -1486,9 +2134,9 @@
           <w:b w:val="0"/>
           <w:sz w:val="19"/>
         </w:rPr>
-        <w:t>Key ideas for Lab 5</w:t>
+        <w:t>Key ideas for Lab 12</w:t>
         <w:tab/>
-        <w:t>22</w:t>
+        <w:t>37</w:t>
       </w:r>
     </w:p>
     <w:p>
@@ -1504,9 +2152,45 @@
           <w:b w:val="0"/>
           <w:sz w:val="19"/>
         </w:rPr>
-        <w:t>How the Team Runs a Campaign</w:t>
+        <w:t>Campaign 4: The YouTube Explainer</w:t>
         <w:tab/>
-        <w:t>22</w:t>
+        <w:t>37</w:t>
+      </w:r>
+    </w:p>
+    <w:p>
+      <w:pPr>
+        <w:tabs>
+          <w:tab w:pos="9648" w:val="right" w:leader="dot"/>
+        </w:tabs>
+        <w:spacing w:after="20"/>
+        <w:ind w:left="360"/>
+      </w:pPr>
+      <w:r>
+        <w:rPr>
+          <w:b w:val="0"/>
+          <w:sz w:val="19"/>
+        </w:rPr>
+        <w:t>Lab 12 — Campaign 4: The YouTube Explainer</w:t>
+        <w:tab/>
+        <w:t>38</w:t>
+      </w:r>
+    </w:p>
+    <w:p>
+      <w:pPr>
+        <w:tabs>
+          <w:tab w:pos="9648" w:val="right" w:leader="dot"/>
+        </w:tabs>
+        <w:spacing w:after="20"/>
+        <w:ind w:left="360"/>
+      </w:pPr>
+      <w:r>
+        <w:rPr>
+          <w:b w:val="0"/>
+          <w:sz w:val="19"/>
+        </w:rPr>
+        <w:t>Topic 3 recap</w:t>
+        <w:tab/>
+        <w:t>39</w:t>
       </w:r>
     </w:p>
     <w:p>
@@ -1522,9 +2206,45 @@
           <w:b w:val="0"/>
           <w:sz w:val="19"/>
         </w:rPr>
-        <w:t>The Five-Beat Storyboard</w:t>
+        <w:t>Where You Are Now</w:t>
         <w:tab/>
-        <w:t>22</w:t>
+        <w:t>39</w:t>
+      </w:r>
+    </w:p>
+    <w:p>
+      <w:pPr>
+        <w:tabs>
+          <w:tab w:pos="9648" w:val="right" w:leader="dot"/>
+        </w:tabs>
+        <w:spacing w:after="60"/>
+        <w:ind w:left="0"/>
+      </w:pPr>
+      <w:r>
+        <w:rPr>
+          <w:b/>
+          <w:sz w:val="21"/>
+        </w:rPr>
+        <w:t>Topic 4 — Content Distribution, Strategy Guidelines and Responsible AI Practices</w:t>
+        <w:tab/>
+        <w:t>40</w:t>
+      </w:r>
+    </w:p>
+    <w:p>
+      <w:pPr>
+        <w:tabs>
+          <w:tab w:pos="9648" w:val="right" w:leader="dot"/>
+        </w:tabs>
+        <w:spacing w:after="20"/>
+        <w:ind w:left="360"/>
+      </w:pPr>
+      <w:r>
+        <w:rPr>
+          <w:b w:val="0"/>
+          <w:sz w:val="19"/>
+        </w:rPr>
+        <w:t>Key ideas for Lab 13</w:t>
+        <w:tab/>
+        <w:t>40</w:t>
       </w:r>
     </w:p>
     <w:p>
@@ -1540,9 +2260,27 @@
           <w:b w:val="0"/>
           <w:sz w:val="19"/>
         </w:rPr>
-        <w:t>Financial Content Is Regulated</w:t>
+        <w:t>From Skill to Schedule</w:t>
         <w:tab/>
-        <w:t>23</w:t>
+        <w:t>40</w:t>
+      </w:r>
+    </w:p>
+    <w:p>
+      <w:pPr>
+        <w:tabs>
+          <w:tab w:pos="9648" w:val="right" w:leader="dot"/>
+        </w:tabs>
+        <w:spacing w:after="20"/>
+        <w:ind w:left="720"/>
+      </w:pPr>
+      <w:r>
+        <w:rPr>
+          <w:b w:val="0"/>
+          <w:sz w:val="19"/>
+        </w:rPr>
+        <w:t>Automate the Preparation, Not the Decision</w:t>
+        <w:tab/>
+        <w:t>40</w:t>
       </w:r>
     </w:p>
     <w:p>
@@ -1558,9 +2296,9 @@
           <w:b w:val="0"/>
           <w:sz w:val="19"/>
         </w:rPr>
-        <w:t>Lab 5 — Campaign 1: Research to Storyboard, with Subagents</w:t>
+        <w:t>Lab 13 — Campaign 5: Always On — the Weekly Growth Report</w:t>
         <w:tab/>
-        <w:t>23</w:t>
+        <w:t>40</w:t>
       </w:r>
     </w:p>
     <w:p>
@@ -1576,9 +2314,9 @@
           <w:b w:val="0"/>
           <w:sz w:val="19"/>
         </w:rPr>
-        <w:t>Topic 1 recap</w:t>
+        <w:t>Key ideas for Lab 14</w:t>
         <w:tab/>
-        <w:t>25</w:t>
+        <w:t>42</w:t>
       </w:r>
     </w:p>
     <w:p>
@@ -1594,9 +2332,9 @@
           <w:b w:val="0"/>
           <w:sz w:val="19"/>
         </w:rPr>
-        <w:t>Where You Are Now</w:t>
+        <w:t>Responsible AI in the Team</w:t>
         <w:tab/>
-        <w:t>25</w:t>
+        <w:t>42</w:t>
       </w:r>
     </w:p>
     <w:p>
@@ -1604,17 +2342,17 @@
         <w:tabs>
           <w:tab w:pos="9648" w:val="right" w:leader="dot"/>
         </w:tabs>
-        <w:spacing w:after="60"/>
-        <w:ind w:left="0"/>
-      </w:pPr>
-      <w:r>
-        <w:rPr>
-          <w:b/>
-          <w:sz w:val="21"/>
-        </w:rPr>
-        <w:t>Topic 2 — Audience Research and Content Requirement Analysis</w:t>
+        <w:spacing w:after="20"/>
+        <w:ind w:left="720"/>
+      </w:pPr>
+      <w:r>
+        <w:rPr>
+          <w:b w:val="0"/>
+          <w:sz w:val="19"/>
+        </w:rPr>
+        <w:t>Measure What Matters</w:t>
         <w:tab/>
-        <w:t>25</w:t>
+        <w:t>42</w:t>
       </w:r>
     </w:p>
     <w:p>
@@ -1630,9 +2368,27 @@
           <w:b w:val="0"/>
           <w:sz w:val="19"/>
         </w:rPr>
-        <w:t>Key ideas for Lab 6</w:t>
+        <w:t>Lab 14 — Measure, Govern and Write the Team Playbook</w:t>
         <w:tab/>
-        <w:t>25</w:t>
+        <w:t>42</w:t>
+      </w:r>
+    </w:p>
+    <w:p>
+      <w:pPr>
+        <w:tabs>
+          <w:tab w:pos="9648" w:val="right" w:leader="dot"/>
+        </w:tabs>
+        <w:spacing w:after="20"/>
+        <w:ind w:left="360"/>
+      </w:pPr>
+      <w:r>
+        <w:rPr>
+          <w:b w:val="0"/>
+          <w:sz w:val="19"/>
+        </w:rPr>
+        <w:t>Key ideas for Lab 15</w:t>
+        <w:tab/>
+        <w:t>43</w:t>
       </w:r>
     </w:p>
     <w:p>
@@ -1648,765 +2404,9 @@
           <w:b w:val="0"/>
           <w:sz w:val="19"/>
         </w:rPr>
-        <w:t>Evidence Before Personas</w:t>
-        <w:tab/>
-        <w:t>25</w:t>
-      </w:r>
-    </w:p>
-    <w:p>
-      <w:pPr>
-        <w:tabs>
-          <w:tab w:pos="9648" w:val="right" w:leader="dot"/>
-        </w:tabs>
-        <w:spacing w:after="20"/>
-        <w:ind w:left="720"/>
-      </w:pPr>
-      <w:r>
-        <w:rPr>
-          <w:b w:val="0"/>
-          <w:sz w:val="19"/>
-        </w:rPr>
-        <w:t>Observed, Inferred or Low Confidence?</w:t>
-        <w:tab/>
-        <w:t>25</w:t>
-      </w:r>
-    </w:p>
-    <w:p>
-      <w:pPr>
-        <w:tabs>
-          <w:tab w:pos="9648" w:val="right" w:leader="dot"/>
-        </w:tabs>
-        <w:spacing w:after="20"/>
-        <w:ind w:left="360"/>
-      </w:pPr>
-      <w:r>
-        <w:rPr>
-          <w:b w:val="0"/>
-          <w:sz w:val="19"/>
-        </w:rPr>
-        <w:t>Lab 6 — Growth Analyst: Personas from Evidence</w:t>
-        <w:tab/>
-        <w:t>26</w:t>
-      </w:r>
-    </w:p>
-    <w:p>
-      <w:pPr>
-        <w:tabs>
-          <w:tab w:pos="9648" w:val="right" w:leader="dot"/>
-        </w:tabs>
-        <w:spacing w:after="20"/>
-        <w:ind w:left="360"/>
-      </w:pPr>
-      <w:r>
-        <w:rPr>
-          <w:b w:val="0"/>
-          <w:sz w:val="19"/>
-        </w:rPr>
-        <w:t>Key ideas for Lab 7</w:t>
-        <w:tab/>
-        <w:t>27</w:t>
-      </w:r>
-    </w:p>
-    <w:p>
-      <w:pPr>
-        <w:tabs>
-          <w:tab w:pos="9648" w:val="right" w:leader="dot"/>
-        </w:tabs>
-        <w:spacing w:after="20"/>
-        <w:ind w:left="720"/>
-      </w:pPr>
-      <w:r>
-        <w:rPr>
-          <w:b w:val="0"/>
-          <w:sz w:val="19"/>
-        </w:rPr>
-        <w:t>Finding the Right Frequency</w:t>
-        <w:tab/>
-        <w:t>27</w:t>
-      </w:r>
-    </w:p>
-    <w:p>
-      <w:pPr>
-        <w:tabs>
-          <w:tab w:pos="9648" w:val="right" w:leader="dot"/>
-        </w:tabs>
-        <w:spacing w:after="20"/>
-        <w:ind w:left="360"/>
-      </w:pPr>
-      <w:r>
-        <w:rPr>
-          <w:b w:val="0"/>
-          <w:sz w:val="19"/>
-        </w:rPr>
-        <w:t>Lab 7 — Growth Analyst and Strategist: Cadence and Calendar</w:t>
-        <w:tab/>
-        <w:t>27</w:t>
-      </w:r>
-    </w:p>
-    <w:p>
-      <w:pPr>
-        <w:tabs>
-          <w:tab w:pos="9648" w:val="right" w:leader="dot"/>
-        </w:tabs>
-        <w:spacing w:after="20"/>
-        <w:ind w:left="360"/>
-      </w:pPr>
-      <w:r>
-        <w:rPr>
-          <w:b w:val="0"/>
-          <w:sz w:val="19"/>
-        </w:rPr>
-        <w:t>Key ideas for Lab 8</w:t>
-        <w:tab/>
-        <w:t>29</w:t>
-      </w:r>
-    </w:p>
-    <w:p>
-      <w:pPr>
-        <w:tabs>
-          <w:tab w:pos="9648" w:val="right" w:leader="dot"/>
-        </w:tabs>
-        <w:spacing w:after="20"/>
-        <w:ind w:left="720"/>
-      </w:pPr>
-      <w:r>
-        <w:rPr>
-          <w:b w:val="0"/>
-          <w:sz w:val="19"/>
-        </w:rPr>
-        <w:t>From Storyboard to Content</w:t>
-        <w:tab/>
-        <w:t>29</w:t>
-      </w:r>
-    </w:p>
-    <w:p>
-      <w:pPr>
-        <w:tabs>
-          <w:tab w:pos="9648" w:val="right" w:leader="dot"/>
-        </w:tabs>
-        <w:spacing w:after="20"/>
-        <w:ind w:left="360"/>
-      </w:pPr>
-      <w:r>
-        <w:rPr>
-          <w:b w:val="0"/>
-          <w:sz w:val="19"/>
-        </w:rPr>
-        <w:t>Lab 8 — Content Creator: A Quick Blog Article</w:t>
-        <w:tab/>
-        <w:t>29</w:t>
-      </w:r>
-    </w:p>
-    <w:p>
-      <w:pPr>
-        <w:tabs>
-          <w:tab w:pos="9648" w:val="right" w:leader="dot"/>
-        </w:tabs>
-        <w:spacing w:after="20"/>
-        <w:ind w:left="360"/>
-      </w:pPr>
-      <w:r>
-        <w:rPr>
-          <w:b w:val="0"/>
-          <w:sz w:val="19"/>
-        </w:rPr>
-        <w:t>Topic 2 recap</w:t>
-        <w:tab/>
-        <w:t>30</w:t>
-      </w:r>
-    </w:p>
-    <w:p>
-      <w:pPr>
-        <w:tabs>
-          <w:tab w:pos="9648" w:val="right" w:leader="dot"/>
-        </w:tabs>
-        <w:spacing w:after="20"/>
-        <w:ind w:left="720"/>
-      </w:pPr>
-      <w:r>
-        <w:rPr>
-          <w:b w:val="0"/>
-          <w:sz w:val="19"/>
-        </w:rPr>
-        <w:t>Day 1: The Team Is Ready</w:t>
-        <w:tab/>
-        <w:t>30</w:t>
-      </w:r>
-    </w:p>
-    <w:p>
-      <w:pPr>
-        <w:tabs>
-          <w:tab w:pos="9648" w:val="right" w:leader="dot"/>
-        </w:tabs>
-        <w:spacing w:after="60"/>
-        <w:ind w:left="0"/>
-      </w:pPr>
-      <w:r>
-        <w:rPr>
-          <w:b/>
-          <w:sz w:val="21"/>
-        </w:rPr>
-        <w:t>Topic 3 — Multi-Channel Content Creation and Agent Workflow Coordination</w:t>
-        <w:tab/>
-        <w:t>30</w:t>
-      </w:r>
-    </w:p>
-    <w:p>
-      <w:pPr>
-        <w:tabs>
-          <w:tab w:pos="9648" w:val="right" w:leader="dot"/>
-        </w:tabs>
-        <w:spacing w:after="20"/>
-        <w:ind w:left="360"/>
-      </w:pPr>
-      <w:r>
-        <w:rPr>
-          <w:b w:val="0"/>
-          <w:sz w:val="19"/>
-        </w:rPr>
-        <w:t>Key ideas for Lab 9</w:t>
-        <w:tab/>
-        <w:t>31</w:t>
-      </w:r>
-    </w:p>
-    <w:p>
-      <w:pPr>
-        <w:tabs>
-          <w:tab w:pos="9648" w:val="right" w:leader="dot"/>
-        </w:tabs>
-        <w:spacing w:after="20"/>
-        <w:ind w:left="720"/>
-      </w:pPr>
-      <w:r>
-        <w:rPr>
-          <w:b w:val="0"/>
-          <w:sz w:val="19"/>
-        </w:rPr>
-        <w:t>Content That Earns a Sign-up</w:t>
-        <w:tab/>
-        <w:t>31</w:t>
-      </w:r>
-    </w:p>
-    <w:p>
-      <w:pPr>
-        <w:tabs>
-          <w:tab w:pos="9648" w:val="right" w:leader="dot"/>
-        </w:tabs>
-        <w:spacing w:after="20"/>
-        <w:ind w:left="360"/>
-      </w:pPr>
-      <w:r>
-        <w:rPr>
-          <w:b w:val="0"/>
-          <w:sz w:val="19"/>
-        </w:rPr>
-        <w:t>Lab 9 — The Lead Magnet: a Checklist and Its Welcome Emails</w:t>
-        <w:tab/>
-        <w:t>31</w:t>
-      </w:r>
-    </w:p>
-    <w:p>
-      <w:pPr>
-        <w:tabs>
-          <w:tab w:pos="9648" w:val="right" w:leader="dot"/>
-        </w:tabs>
-        <w:spacing w:after="20"/>
-        <w:ind w:left="360"/>
-      </w:pPr>
-      <w:r>
-        <w:rPr>
-          <w:b w:val="0"/>
-          <w:sz w:val="19"/>
-        </w:rPr>
-        <w:t>Key ideas for Lab 10</w:t>
-        <w:tab/>
-        <w:t>33</w:t>
-      </w:r>
-    </w:p>
-    <w:p>
-      <w:pPr>
-        <w:tabs>
-          <w:tab w:pos="9648" w:val="right" w:leader="dot"/>
-        </w:tabs>
-        <w:spacing w:after="20"/>
-        <w:ind w:left="720"/>
-      </w:pPr>
-      <w:r>
-        <w:rPr>
-          <w:b w:val="0"/>
-          <w:sz w:val="19"/>
-        </w:rPr>
-        <w:t>Subagents in Codex</w:t>
-        <w:tab/>
-        <w:t>33</w:t>
-      </w:r>
-    </w:p>
-    <w:p>
-      <w:pPr>
-        <w:tabs>
-          <w:tab w:pos="9648" w:val="right" w:leader="dot"/>
-        </w:tabs>
-        <w:spacing w:after="20"/>
-        <w:ind w:left="720"/>
-      </w:pPr>
-      <w:r>
-        <w:rPr>
-          <w:b w:val="0"/>
-          <w:sz w:val="19"/>
-        </w:rPr>
-        <w:t>Parallel, Then Review</w:t>
-        <w:tab/>
-        <w:t>33</w:t>
-      </w:r>
-    </w:p>
-    <w:p>
-      <w:pPr>
-        <w:tabs>
-          <w:tab w:pos="9648" w:val="right" w:leader="dot"/>
-        </w:tabs>
-        <w:spacing w:after="20"/>
-        <w:ind w:left="720"/>
-      </w:pPr>
-      <w:r>
-        <w:rPr>
-          <w:b w:val="0"/>
-          <w:sz w:val="19"/>
-        </w:rPr>
-        <w:t>Human in the Loop, Enforced</w:t>
-        <w:tab/>
-        <w:t>33</w:t>
-      </w:r>
-    </w:p>
-    <w:p>
-      <w:pPr>
-        <w:tabs>
-          <w:tab w:pos="9648" w:val="right" w:leader="dot"/>
-        </w:tabs>
-        <w:spacing w:after="20"/>
-        <w:ind w:left="720"/>
-      </w:pPr>
-      <w:r>
-        <w:rPr>
-          <w:b w:val="0"/>
-          <w:sz w:val="19"/>
-        </w:rPr>
-        <w:t>The Hook That Holds the Gate</w:t>
-        <w:tab/>
-        <w:t>33</w:t>
-      </w:r>
-    </w:p>
-    <w:p>
-      <w:pPr>
-        <w:tabs>
-          <w:tab w:pos="9648" w:val="right" w:leader="dot"/>
-        </w:tabs>
-        <w:spacing w:after="20"/>
-        <w:ind w:left="720"/>
-      </w:pPr>
-      <w:r>
-        <w:rPr>
-          <w:b w:val="0"/>
-          <w:sz w:val="19"/>
-        </w:rPr>
-        <w:t>The Publishing APIs</w:t>
-        <w:tab/>
-        <w:t>33</w:t>
-      </w:r>
-    </w:p>
-    <w:p>
-      <w:pPr>
-        <w:tabs>
-          <w:tab w:pos="9648" w:val="right" w:leader="dot"/>
-        </w:tabs>
-        <w:spacing w:after="20"/>
-        <w:ind w:left="720"/>
-      </w:pPr>
-      <w:r>
-        <w:rPr>
-          <w:b w:val="0"/>
-          <w:sz w:val="19"/>
-        </w:rPr>
-        <w:t>Campaign 2: A Social Media Week</w:t>
-        <w:tab/>
-        <w:t>34</w:t>
-      </w:r>
-    </w:p>
-    <w:p>
-      <w:pPr>
-        <w:tabs>
-          <w:tab w:pos="9648" w:val="right" w:leader="dot"/>
-        </w:tabs>
-        <w:spacing w:after="20"/>
-        <w:ind w:left="360"/>
-      </w:pPr>
-      <w:r>
-        <w:rPr>
-          <w:b w:val="0"/>
-          <w:sz w:val="19"/>
-        </w:rPr>
-        <w:t>Lab 10 — Campaign 2: Social Media Posts (Demo)</w:t>
-        <w:tab/>
-        <w:t>34</w:t>
-      </w:r>
-    </w:p>
-    <w:p>
-      <w:pPr>
-        <w:tabs>
-          <w:tab w:pos="9648" w:val="right" w:leader="dot"/>
-        </w:tabs>
-        <w:spacing w:after="20"/>
-        <w:ind w:left="360"/>
-      </w:pPr>
-      <w:r>
-        <w:rPr>
-          <w:b w:val="0"/>
-          <w:sz w:val="19"/>
-        </w:rPr>
-        <w:t>Key ideas for Lab 11</w:t>
-        <w:tab/>
-        <w:t>36</w:t>
-      </w:r>
-    </w:p>
-    <w:p>
-      <w:pPr>
-        <w:tabs>
-          <w:tab w:pos="9648" w:val="right" w:leader="dot"/>
-        </w:tabs>
-        <w:spacing w:after="20"/>
-        <w:ind w:left="720"/>
-      </w:pPr>
-      <w:r>
-        <w:rPr>
-          <w:b w:val="0"/>
-          <w:sz w:val="19"/>
-        </w:rPr>
-        <w:t>Campaign 3: Newsletter + Landing Page</w:t>
-        <w:tab/>
-        <w:t>36</w:t>
-      </w:r>
-    </w:p>
-    <w:p>
-      <w:pPr>
-        <w:tabs>
-          <w:tab w:pos="9648" w:val="right" w:leader="dot"/>
-        </w:tabs>
-        <w:spacing w:after="20"/>
-        <w:ind w:left="720"/>
-      </w:pPr>
-      <w:r>
-        <w:rPr>
-          <w:b w:val="0"/>
-          <w:sz w:val="19"/>
-        </w:rPr>
-        <w:t>Consent Decides Who Gets Mail</w:t>
-        <w:tab/>
-        <w:t>36</w:t>
-      </w:r>
-    </w:p>
-    <w:p>
-      <w:pPr>
-        <w:tabs>
-          <w:tab w:pos="9648" w:val="right" w:leader="dot"/>
-        </w:tabs>
-        <w:spacing w:after="20"/>
-        <w:ind w:left="360"/>
-      </w:pPr>
-      <w:r>
-        <w:rPr>
-          <w:b w:val="0"/>
-          <w:sz w:val="19"/>
-        </w:rPr>
-        <w:t>Lab 11 — Campaign 3: Newsletter and a Landing Page</w:t>
-        <w:tab/>
-        <w:t>36</w:t>
-      </w:r>
-    </w:p>
-    <w:p>
-      <w:pPr>
-        <w:tabs>
-          <w:tab w:pos="9648" w:val="right" w:leader="dot"/>
-        </w:tabs>
-        <w:spacing w:after="20"/>
-        <w:ind w:left="360"/>
-      </w:pPr>
-      <w:r>
-        <w:rPr>
-          <w:b w:val="0"/>
-          <w:sz w:val="19"/>
-        </w:rPr>
-        <w:t>Key ideas for Lab 12</w:t>
-        <w:tab/>
-        <w:t>38</w:t>
-      </w:r>
-    </w:p>
-    <w:p>
-      <w:pPr>
-        <w:tabs>
-          <w:tab w:pos="9648" w:val="right" w:leader="dot"/>
-        </w:tabs>
-        <w:spacing w:after="20"/>
-        <w:ind w:left="720"/>
-      </w:pPr>
-      <w:r>
-        <w:rPr>
-          <w:b w:val="0"/>
-          <w:sz w:val="19"/>
-        </w:rPr>
-        <w:t>Campaign 4: The YouTube Explainer</w:t>
-        <w:tab/>
-        <w:t>38</w:t>
-      </w:r>
-    </w:p>
-    <w:p>
-      <w:pPr>
-        <w:tabs>
-          <w:tab w:pos="9648" w:val="right" w:leader="dot"/>
-        </w:tabs>
-        <w:spacing w:after="20"/>
-        <w:ind w:left="360"/>
-      </w:pPr>
-      <w:r>
-        <w:rPr>
-          <w:b w:val="0"/>
-          <w:sz w:val="19"/>
-        </w:rPr>
-        <w:t>Lab 12 — Campaign 4: The YouTube Explainer</w:t>
-        <w:tab/>
-        <w:t>38</w:t>
-      </w:r>
-    </w:p>
-    <w:p>
-      <w:pPr>
-        <w:tabs>
-          <w:tab w:pos="9648" w:val="right" w:leader="dot"/>
-        </w:tabs>
-        <w:spacing w:after="20"/>
-        <w:ind w:left="360"/>
-      </w:pPr>
-      <w:r>
-        <w:rPr>
-          <w:b w:val="0"/>
-          <w:sz w:val="19"/>
-        </w:rPr>
-        <w:t>Topic 3 recap</w:t>
-        <w:tab/>
-        <w:t>39</w:t>
-      </w:r>
-    </w:p>
-    <w:p>
-      <w:pPr>
-        <w:tabs>
-          <w:tab w:pos="9648" w:val="right" w:leader="dot"/>
-        </w:tabs>
-        <w:spacing w:after="20"/>
-        <w:ind w:left="720"/>
-      </w:pPr>
-      <w:r>
-        <w:rPr>
-          <w:b w:val="0"/>
-          <w:sz w:val="19"/>
-        </w:rPr>
-        <w:t>Where You Are Now</w:t>
-        <w:tab/>
-        <w:t>39</w:t>
-      </w:r>
-    </w:p>
-    <w:p>
-      <w:pPr>
-        <w:tabs>
-          <w:tab w:pos="9648" w:val="right" w:leader="dot"/>
-        </w:tabs>
-        <w:spacing w:after="60"/>
-        <w:ind w:left="0"/>
-      </w:pPr>
-      <w:r>
-        <w:rPr>
-          <w:b/>
-          <w:sz w:val="21"/>
-        </w:rPr>
-        <w:t>Topic 4 — Content Distribution, Strategy Guidelines and Responsible AI Practices</w:t>
-        <w:tab/>
-        <w:t>40</w:t>
-      </w:r>
-    </w:p>
-    <w:p>
-      <w:pPr>
-        <w:tabs>
-          <w:tab w:pos="9648" w:val="right" w:leader="dot"/>
-        </w:tabs>
-        <w:spacing w:after="20"/>
-        <w:ind w:left="360"/>
-      </w:pPr>
-      <w:r>
-        <w:rPr>
-          <w:b w:val="0"/>
-          <w:sz w:val="19"/>
-        </w:rPr>
-        <w:t>Key ideas for Lab 13</w:t>
-        <w:tab/>
-        <w:t>40</w:t>
-      </w:r>
-    </w:p>
-    <w:p>
-      <w:pPr>
-        <w:tabs>
-          <w:tab w:pos="9648" w:val="right" w:leader="dot"/>
-        </w:tabs>
-        <w:spacing w:after="20"/>
-        <w:ind w:left="720"/>
-      </w:pPr>
-      <w:r>
-        <w:rPr>
-          <w:b w:val="0"/>
-          <w:sz w:val="19"/>
-        </w:rPr>
-        <w:t>From Skill to Schedule</w:t>
-        <w:tab/>
-        <w:t>40</w:t>
-      </w:r>
-    </w:p>
-    <w:p>
-      <w:pPr>
-        <w:tabs>
-          <w:tab w:pos="9648" w:val="right" w:leader="dot"/>
-        </w:tabs>
-        <w:spacing w:after="20"/>
-        <w:ind w:left="720"/>
-      </w:pPr>
-      <w:r>
-        <w:rPr>
-          <w:b w:val="0"/>
-          <w:sz w:val="19"/>
-        </w:rPr>
-        <w:t>Automate the Preparation, Not the Decision</w:t>
-        <w:tab/>
-        <w:t>40</w:t>
-      </w:r>
-    </w:p>
-    <w:p>
-      <w:pPr>
-        <w:tabs>
-          <w:tab w:pos="9648" w:val="right" w:leader="dot"/>
-        </w:tabs>
-        <w:spacing w:after="20"/>
-        <w:ind w:left="360"/>
-      </w:pPr>
-      <w:r>
-        <w:rPr>
-          <w:b w:val="0"/>
-          <w:sz w:val="19"/>
-        </w:rPr>
-        <w:t>Lab 13 — Campaign 5: Always On — the Weekly Growth Report</w:t>
-        <w:tab/>
-        <w:t>40</w:t>
-      </w:r>
-    </w:p>
-    <w:p>
-      <w:pPr>
-        <w:tabs>
-          <w:tab w:pos="9648" w:val="right" w:leader="dot"/>
-        </w:tabs>
-        <w:spacing w:after="20"/>
-        <w:ind w:left="360"/>
-      </w:pPr>
-      <w:r>
-        <w:rPr>
-          <w:b w:val="0"/>
-          <w:sz w:val="19"/>
-        </w:rPr>
-        <w:t>Key ideas for Lab 14</w:t>
-        <w:tab/>
-        <w:t>42</w:t>
-      </w:r>
-    </w:p>
-    <w:p>
-      <w:pPr>
-        <w:tabs>
-          <w:tab w:pos="9648" w:val="right" w:leader="dot"/>
-        </w:tabs>
-        <w:spacing w:after="20"/>
-        <w:ind w:left="720"/>
-      </w:pPr>
-      <w:r>
-        <w:rPr>
-          <w:b w:val="0"/>
-          <w:sz w:val="19"/>
-        </w:rPr>
-        <w:t>Responsible AI in the Team</w:t>
-        <w:tab/>
-        <w:t>42</w:t>
-      </w:r>
-    </w:p>
-    <w:p>
-      <w:pPr>
-        <w:tabs>
-          <w:tab w:pos="9648" w:val="right" w:leader="dot"/>
-        </w:tabs>
-        <w:spacing w:after="20"/>
-        <w:ind w:left="720"/>
-      </w:pPr>
-      <w:r>
-        <w:rPr>
-          <w:b w:val="0"/>
-          <w:sz w:val="19"/>
-        </w:rPr>
-        <w:t>Measure What Matters</w:t>
-        <w:tab/>
-        <w:t>42</w:t>
-      </w:r>
-    </w:p>
-    <w:p>
-      <w:pPr>
-        <w:tabs>
-          <w:tab w:pos="9648" w:val="right" w:leader="dot"/>
-        </w:tabs>
-        <w:spacing w:after="20"/>
-        <w:ind w:left="360"/>
-      </w:pPr>
-      <w:r>
-        <w:rPr>
-          <w:b w:val="0"/>
-          <w:sz w:val="19"/>
-        </w:rPr>
-        <w:t>Lab 14 — Measure, Govern and Write the Team Playbook</w:t>
-        <w:tab/>
-        <w:t>42</w:t>
-      </w:r>
-    </w:p>
-    <w:p>
-      <w:pPr>
-        <w:tabs>
-          <w:tab w:pos="9648" w:val="right" w:leader="dot"/>
-        </w:tabs>
-        <w:spacing w:after="20"/>
-        <w:ind w:left="360"/>
-      </w:pPr>
-      <w:r>
-        <w:rPr>
-          <w:b w:val="0"/>
-          <w:sz w:val="19"/>
-        </w:rPr>
-        <w:t>Key ideas for Lab 15</w:t>
-        <w:tab/>
-        <w:t>44</w:t>
-      </w:r>
-    </w:p>
-    <w:p>
-      <w:pPr>
-        <w:tabs>
-          <w:tab w:pos="9648" w:val="right" w:leader="dot"/>
-        </w:tabs>
-        <w:spacing w:after="20"/>
-        <w:ind w:left="720"/>
-      </w:pPr>
-      <w:r>
-        <w:rPr>
-          <w:b w:val="0"/>
-          <w:sz w:val="19"/>
-        </w:rPr>
         <w:t>Dots: Always-On Agent Coworkers</w:t>
         <w:tab/>
-        <w:t>44</w:t>
+        <w:t>43</w:t>
       </w:r>
     </w:p>
     <w:p>
@@ -3816,6 +3816,82 @@
           <w:i/>
         </w:rPr>
         <w:t>Tip: Day 2 assessment: Written Assessment 4:00–5:00 PM, Practical Performance 5:00–6:00 PM.</w:t>
+      </w:r>
+    </w:p>
+    <w:p>
+      <w:pPr>
+        <w:pStyle w:val="Heading1"/>
+      </w:pPr>
+      <w:r>
+        <w:t>Topic 1 — Multi-AI-Agent Content Ideation and Digital Storyboarding</w:t>
+      </w:r>
+    </w:p>
+    <w:p>
+      <w:r>
+        <w:t>Slides 16–72. In this topic you will:</w:t>
+      </w:r>
+    </w:p>
+    <w:p>
+      <w:pPr>
+        <w:pStyle w:val="ListBullet"/>
+      </w:pPr>
+      <w:r>
+        <w:rPr>
+          <w:b w:val="0"/>
+        </w:rPr>
+        <w:t>AI agents, the tools, and Horizon's story</w:t>
+      </w:r>
+    </w:p>
+    <w:p>
+      <w:pPr>
+        <w:pStyle w:val="ListBullet"/>
+      </w:pPr>
+      <w:r>
+        <w:rPr>
+          <w:b w:val="0"/>
+        </w:rPr>
+        <w:t>Why a team of agents</w:t>
+      </w:r>
+    </w:p>
+    <w:p>
+      <w:pPr>
+        <w:pStyle w:val="ListBullet"/>
+      </w:pPr>
+      <w:r>
+        <w:rPr>
+          <w:b w:val="0"/>
+        </w:rPr>
+        <w:t>A home for the team; Horizon's public website</w:t>
+      </w:r>
+    </w:p>
+    <w:p>
+      <w:pPr>
+        <w:pStyle w:val="ListBullet"/>
+      </w:pPr>
+      <w:r>
+        <w:rPr>
+          <w:b w:val="0"/>
+        </w:rPr>
+        <w:t>Form the team: instructions, skills, connectors</w:t>
+      </w:r>
+    </w:p>
+    <w:p>
+      <w:pPr>
+        <w:pStyle w:val="ListBullet"/>
+      </w:pPr>
+      <w:r>
+        <w:rPr>
+          <w:b w:val="0"/>
+        </w:rPr>
+        <w:t>Campaign 1: research, ideas and a storyboard</w:t>
+      </w:r>
+    </w:p>
+    <w:p>
+      <w:pPr>
+        <w:pStyle w:val="Heading2"/>
+      </w:pPr>
+      <w:r>
+        <w:t>Key ideas for Lab 1</w:t>
       </w:r>
     </w:p>
     <w:p>
@@ -6184,71 +6260,6 @@
           <w:i/>
         </w:rPr>
         <w:t>Tip: Every external post, email and video passes one gate: a person approves the exact version.</w:t>
-      </w:r>
-    </w:p>
-    <w:p>
-      <w:pPr>
-        <w:pStyle w:val="Heading1"/>
-      </w:pPr>
-      <w:r>
-        <w:t>Topic 1 — Multi-AI-Agent Content Ideation and Digital Storyboarding</w:t>
-      </w:r>
-    </w:p>
-    <w:p>
-      <w:r>
-        <w:t>Slides 29–72. In this topic you will:</w:t>
-      </w:r>
-    </w:p>
-    <w:p>
-      <w:pPr>
-        <w:pStyle w:val="ListBullet"/>
-      </w:pPr>
-      <w:r>
-        <w:rPr>
-          <w:b w:val="0"/>
-        </w:rPr>
-        <w:t>Why a team of agents</w:t>
-      </w:r>
-    </w:p>
-    <w:p>
-      <w:pPr>
-        <w:pStyle w:val="ListBullet"/>
-      </w:pPr>
-      <w:r>
-        <w:rPr>
-          <w:b w:val="0"/>
-        </w:rPr>
-        <w:t>A home for the team; Horizon's public website</w:t>
-      </w:r>
-    </w:p>
-    <w:p>
-      <w:pPr>
-        <w:pStyle w:val="ListBullet"/>
-      </w:pPr>
-      <w:r>
-        <w:rPr>
-          <w:b w:val="0"/>
-        </w:rPr>
-        <w:t>Form the team: instructions, skills, connectors</w:t>
-      </w:r>
-    </w:p>
-    <w:p>
-      <w:pPr>
-        <w:pStyle w:val="ListBullet"/>
-      </w:pPr>
-      <w:r>
-        <w:rPr>
-          <w:b w:val="0"/>
-        </w:rPr>
-        <w:t>Campaign 1: research, ideas and a storyboard</w:t>
-      </w:r>
-    </w:p>
-    <w:p>
-      <w:pPr>
-        <w:pStyle w:val="Heading2"/>
-      </w:pPr>
-      <w:r>
-        <w:t>Key ideas for Lab 1</w:t>
       </w:r>
     </w:p>
     <w:p>

</xml_diff>

<commit_message>
docs: history slide — prompt, context and harness engineering, then AI agents
Co-Authored-By: Claude Opus 5.5 <noreply@anthropic.com>
</commit_message>
<xml_diff>
--- a/courseware_chatgpt/LG-Multi AI Agents Workflow for Content Creation - ChatGPT-v3.5.docx
+++ b/courseware_chatgpt/LG-Multi AI Agents Workflow for Content Creation - ChatGPT-v3.5.docx
@@ -4327,13 +4327,13 @@
         <w:rPr>
           <w:b/>
         </w:rPr>
-        <w:t>2023 · Chatbots</w:t>
-      </w:r>
-      <w:r>
-        <w:rPr>
-          <w:b w:val="0"/>
-        </w:rPr>
-        <w:t xml:space="preserve"> — ChatGPT goes mainstream; Anthropic launches Claude (March). The skill: prompt engineering.</w:t>
+        <w:t>2023 · Prompt Engineering</w:t>
+      </w:r>
+      <w:r>
+        <w:rPr>
+          <w:b w:val="0"/>
+        </w:rPr>
+        <w:t xml:space="preserve"> — ChatGPT goes mainstream; Anthropic launches Claude (March). Results depend on how you word the prompt.</w:t>
       </w:r>
     </w:p>
     <w:p>
@@ -4344,13 +4344,13 @@
         <w:rPr>
           <w:b/>
         </w:rPr>
-        <w:t>2024 · Tools and MCP</w:t>
-      </w:r>
-      <w:r>
-        <w:rPr>
-          <w:b w:val="0"/>
-        </w:rPr>
-        <w:t xml:space="preserve"> — Models call tools. Anthropic open-sources the Model Context Protocol (Nov). The skill: context engineering.</w:t>
+        <w:t>2024 · Context Engineering</w:t>
+      </w:r>
+      <w:r>
+        <w:rPr>
+          <w:b w:val="0"/>
+        </w:rPr>
+        <w:t xml:space="preserve"> — Models call tools. Anthropic open-sources the Model Context Protocol (Nov). Results depend on what the model can see.</w:t>
       </w:r>
     </w:p>
     <w:p>
@@ -4361,13 +4361,13 @@
         <w:rPr>
           <w:b/>
         </w:rPr>
-        <w:t>2025 · Agentic AI</w:t>
-      </w:r>
-      <w:r>
-        <w:rPr>
-          <w:b w:val="0"/>
-        </w:rPr>
-        <w:t xml:space="preserve"> — Claude Code and Codex: agents plan, act and check their own work. The skill: harness engineering.</w:t>
+        <w:t>2025 · Harness Engineering</w:t>
+      </w:r>
+      <w:r>
+        <w:rPr>
+          <w:b w:val="0"/>
+        </w:rPr>
+        <w:t xml:space="preserve"> — Claude Code and Codex: agents plan, act and check their own work. Results depend on the system around the model.</w:t>
       </w:r>
     </w:p>
     <w:p>
@@ -4378,7 +4378,7 @@
         <w:rPr>
           <w:b/>
         </w:rPr>
-        <w:t>2026 · Agent Teams</w:t>
+        <w:t>2026 · AI Agents</w:t>
       </w:r>
       <w:r>
         <w:rPr>

</xml_diff>

<commit_message>
docs: history slide — harness engineering (e.g. Claude Code, Codex) gives rise to agentic AI; AI agents work 24/7
Co-Authored-By: Claude Opus 5.5 <noreply@anthropic.com>
</commit_message>
<xml_diff>
--- a/courseware_chatgpt/LG-Multi AI Agents Workflow for Content Creation - ChatGPT-v3.5.docx
+++ b/courseware_chatgpt/LG-Multi AI Agents Workflow for Content Creation - ChatGPT-v3.5.docx
@@ -4367,7 +4367,7 @@
         <w:rPr>
           <w:b w:val="0"/>
         </w:rPr>
-        <w:t xml:space="preserve"> — Claude Code and Codex: agents plan, act and check their own work. Results depend on the system around the model.</w:t>
+        <w:t xml:space="preserve"> — E.g. Claude Code and Codex. The system around the model gives rise to agentic AI: task-oriented agents that plan, act and check their work.</w:t>
       </w:r>
     </w:p>
     <w:p>
@@ -4384,12 +4384,12 @@
         <w:rPr>
           <w:b w:val="0"/>
         </w:rPr>
-        <w:t xml:space="preserve"> — ChatGPT Work and Codex subagents; workspace agents and always-on Dots.</w:t>
-      </w:r>
-    </w:p>
-    <w:p>
-      <w:r>
-        <w:t>From wording one prompt, to curating context, to engineering the whole system around the model — and now, teams of agents.</w:t>
+        <w:t xml:space="preserve"> — Always-on agents that work 24/7 on their own, e.g. OpenClaw, Hermes Agent and ChatGPT Dots.</w:t>
+      </w:r>
+    </w:p>
+    <w:p>
+      <w:r>
+        <w:t>From wording one prompt, to curating context, to engineering the system around the model — and now, agents that work around the clock.</w:t>
       </w:r>
     </w:p>
     <w:p>

</xml_diff>

<commit_message>
feat(labs): Lab 10 posts with images, post-it-yourself flow, interactive review
- Lab 10 (Claude): the designer makes both images (LinkedIn 1200x627,
  Facebook 1080x1080); Prompt B makes a "ready to post" artifact and the
  learner posts by hand; posting through the API is an optional last step.
- Labs 10-11: the review artifact has working Approve / Request changes
  buttons (JavaScript) and a bottom bar that builds the line to paste.
- Publisher kit: publish.mjs uploads each post's image (LinkedIn Images
  API; Facebook Page /photos with alt text); the approval hash covers the
  image. Facebook Graph default v26.0.
- Skills channel-formats, linkedin-post, facebook-post, brand-visuals:
  image sizes, image/alt frontmatter, briefs, how a post goes out.
- Lab steps over eight split across two slides. Rebuilt decks, LP, LG,
  labs and the Prompts pages for both editions. *.zip now gitignored.

Co-Authored-By: Claude Opus 5.5 <noreply@anthropic.com>
</commit_message>
<xml_diff>
--- a/courseware_chatgpt/LG-Multi AI Agents Workflow for Content Creation - ChatGPT-v3.5.docx
+++ b/courseware_chatgpt/LG-Multi AI Agents Workflow for Content Creation - ChatGPT-v3.5.docx
@@ -14720,7 +14720,7 @@
         <w:rPr>
           <w:sz w:val="21"/>
         </w:rPr>
-        <w:t>- creative-designer: one image per post with $imagegen and alt text, from the brief. Then run fact-check and fin-compliance on every post and send each fix back to the right subagent. When a post passes, run node scripts/submit.mjs on it. Publish nothing. Write for a business owner, in plain English: no codes, IDs, file names or line numbers; start with what it means and what I do next. Save a Word copy (.docx) of each result.</w:t>
+        <w:t>- creative-designer: one image per post with $imagegen and alt text, from the brief. Save each as a PNG beside its post and fill in the post's image and alt lines, so the image is posted with it. Then run fact-check and fin-compliance on every post and send each fix back to the right subagent. When a post passes, run node scripts/submit.mjs on it. Publish nothing. Write for a business owner, in plain English: no codes, IDs, file names or line numbers; start with what it means and what I do next. Save a Word copy (.docx) of each result.</w:t>
       </w:r>
     </w:p>
     <w:p>
@@ -14842,7 +14842,7 @@
         <w:rPr>
           <w:b w:val="0"/>
         </w:rPr>
-        <w:t>☐  Two posts with images, alt text, frontmatter and UTM links.</w:t>
+        <w:t>☐  Two posts with images, alt text, frontmatter and UTM links; each dry run shows its image being uploaded.</w:t>
       </w:r>
     </w:p>
     <w:p>

</xml_diff>

<commit_message>
feat(labs): posts link to each learner's own localhost site; Lab 10 kit update and app posting
- scripts/serve-site.mjs (new, both editions): "Start my website" serves
  web/site/ at http://localhost:8080/. Every post links there (owner
  decision 11 Oct 2026): Lab 1 step, charter, channel-formats skill and
  publishing spec.
- Lab 10 Prompt A "Get the latest kit": the agent downloads the current
  scripts and guides from this repo into the learner's studio, adds the
  link and chat-approval rules to the charter and starts the site — for
  labs downloaded before a fix. Team is now Prompt B, posting Prompt C.
- Lab 10 "Optional: post through LinkedIn and Facebook": eight no-code
  steps (README and Learner Guide). env.example ships in the studio.
- gate-hook: in a Claude studio the block message points to the chat only.

Co-Authored-By: Claude Opus 5.5 <noreply@anthropic.com>
</commit_message>
<xml_diff>
--- a/courseware_chatgpt/LG-Multi AI Agents Workflow for Content Creation - ChatGPT-v3.5.docx
+++ b/courseware_chatgpt/LG-Multi AI Agents Workflow for Content Creation - ChatGPT-v3.5.docx
@@ -2064,7 +2064,7 @@
         </w:rPr>
         <w:t>Key ideas for Lab 11</w:t>
         <w:tab/>
-        <w:t>35</w:t>
+        <w:t>36</w:t>
       </w:r>
     </w:p>
     <w:p>
@@ -2082,7 +2082,7 @@
         </w:rPr>
         <w:t>Campaign 3: Newsletter + Landing Page</w:t>
         <w:tab/>
-        <w:t>35</w:t>
+        <w:t>36</w:t>
       </w:r>
     </w:p>
     <w:p>
@@ -2100,7 +2100,7 @@
         </w:rPr>
         <w:t>Consent Decides Who Gets Mail</w:t>
         <w:tab/>
-        <w:t>36</w:t>
+        <w:t>37</w:t>
       </w:r>
     </w:p>
     <w:p>
@@ -2118,7 +2118,7 @@
         </w:rPr>
         <w:t>Lab 11 — Campaign 3: Newsletter and a Landing Page</w:t>
         <w:tab/>
-        <w:t>36</w:t>
+        <w:t>37</w:t>
       </w:r>
     </w:p>
     <w:p>
@@ -2136,7 +2136,7 @@
         </w:rPr>
         <w:t>Key ideas for Lab 12</w:t>
         <w:tab/>
-        <w:t>37</w:t>
+        <w:t>38</w:t>
       </w:r>
     </w:p>
     <w:p>
@@ -2154,7 +2154,7 @@
         </w:rPr>
         <w:t>Campaign 4: The YouTube Explainer</w:t>
         <w:tab/>
-        <w:t>37</w:t>
+        <w:t>38</w:t>
       </w:r>
     </w:p>
     <w:p>
@@ -2172,7 +2172,7 @@
         </w:rPr>
         <w:t>Lab 12 — Campaign 4: The YouTube Explainer</w:t>
         <w:tab/>
-        <w:t>38</w:t>
+        <w:t>39</w:t>
       </w:r>
     </w:p>
     <w:p>
@@ -2190,7 +2190,7 @@
         </w:rPr>
         <w:t>Topic 3 recap</w:t>
         <w:tab/>
-        <w:t>39</w:t>
+        <w:t>40</w:t>
       </w:r>
     </w:p>
     <w:p>
@@ -2208,7 +2208,7 @@
         </w:rPr>
         <w:t>Where You Are Now</w:t>
         <w:tab/>
-        <w:t>39</w:t>
+        <w:t>40</w:t>
       </w:r>
     </w:p>
     <w:p>
@@ -2226,7 +2226,7 @@
         </w:rPr>
         <w:t>Topic 4 — Content Distribution, Strategy Guidelines and Responsible AI Practices</w:t>
         <w:tab/>
-        <w:t>40</w:t>
+        <w:t>41</w:t>
       </w:r>
     </w:p>
     <w:p>
@@ -2244,7 +2244,7 @@
         </w:rPr>
         <w:t>Key ideas for Lab 13</w:t>
         <w:tab/>
-        <w:t>40</w:t>
+        <w:t>41</w:t>
       </w:r>
     </w:p>
     <w:p>
@@ -2262,7 +2262,7 @@
         </w:rPr>
         <w:t>From Skill to Schedule</w:t>
         <w:tab/>
-        <w:t>40</w:t>
+        <w:t>41</w:t>
       </w:r>
     </w:p>
     <w:p>
@@ -2280,7 +2280,7 @@
         </w:rPr>
         <w:t>Automate the Preparation, Not the Decision</w:t>
         <w:tab/>
-        <w:t>40</w:t>
+        <w:t>41</w:t>
       </w:r>
     </w:p>
     <w:p>
@@ -2298,7 +2298,7 @@
         </w:rPr>
         <w:t>Lab 13 — Campaign 5: Always On — the Weekly Growth Report</w:t>
         <w:tab/>
-        <w:t>40</w:t>
+        <w:t>41</w:t>
       </w:r>
     </w:p>
     <w:p>
@@ -2316,7 +2316,7 @@
         </w:rPr>
         <w:t>Key ideas for Lab 14</w:t>
         <w:tab/>
-        <w:t>42</w:t>
+        <w:t>43</w:t>
       </w:r>
     </w:p>
     <w:p>
@@ -2334,7 +2334,7 @@
         </w:rPr>
         <w:t>Responsible AI in the Team</w:t>
         <w:tab/>
-        <w:t>42</w:t>
+        <w:t>43</w:t>
       </w:r>
     </w:p>
     <w:p>
@@ -2352,7 +2352,7 @@
         </w:rPr>
         <w:t>Measure What Matters</w:t>
         <w:tab/>
-        <w:t>42</w:t>
+        <w:t>43</w:t>
       </w:r>
     </w:p>
     <w:p>
@@ -2370,7 +2370,7 @@
         </w:rPr>
         <w:t>Lab 14 — Measure, Govern and Write the Team Playbook</w:t>
         <w:tab/>
-        <w:t>42</w:t>
+        <w:t>43</w:t>
       </w:r>
     </w:p>
     <w:p>
@@ -2388,7 +2388,7 @@
         </w:rPr>
         <w:t>Key ideas for Lab 15</w:t>
         <w:tab/>
-        <w:t>43</w:t>
+        <w:t>44</w:t>
       </w:r>
     </w:p>
     <w:p>
@@ -2406,7 +2406,7 @@
         </w:rPr>
         <w:t>Dots: Always-On Agent Coworkers</w:t>
         <w:tab/>
-        <w:t>43</w:t>
+        <w:t>44</w:t>
       </w:r>
     </w:p>
     <w:p>
@@ -2424,7 +2424,7 @@
         </w:rPr>
         <w:t>Workspace Agents</w:t>
         <w:tab/>
-        <w:t>44</w:t>
+        <w:t>45</w:t>
       </w:r>
     </w:p>
     <w:p>
@@ -2442,7 +2442,7 @@
         </w:rPr>
         <w:t>Lab 15 — Optional Demo: a Dot Team Lead and Workspace Agents</w:t>
         <w:tab/>
-        <w:t>44</w:t>
+        <w:t>45</w:t>
       </w:r>
     </w:p>
     <w:p>
@@ -2460,7 +2460,7 @@
         </w:rPr>
         <w:t>Course Summary</w:t>
         <w:tab/>
-        <w:t>45</w:t>
+        <w:t>46</w:t>
       </w:r>
     </w:p>
     <w:p>
@@ -2478,7 +2478,7 @@
         </w:rPr>
         <w:t>How Each Pattern Is Triggered</w:t>
         <w:tab/>
-        <w:t>45</w:t>
+        <w:t>46</w:t>
       </w:r>
     </w:p>
     <w:p>
@@ -2496,7 +2496,7 @@
         </w:rPr>
         <w:t>Horizon: One Team, Five Campaigns</w:t>
         <w:tab/>
-        <w:t>45</w:t>
+        <w:t>46</w:t>
       </w:r>
     </w:p>
     <w:p>
@@ -2514,7 +2514,7 @@
         </w:rPr>
         <w:t>Quick Command Reference</w:t>
         <w:tab/>
-        <w:t>46</w:t>
+        <w:t>47</w:t>
       </w:r>
     </w:p>
     <w:p>
@@ -2532,7 +2532,7 @@
         </w:rPr>
         <w:t>Support</w:t>
         <w:tab/>
-        <w:t>46</w:t>
+        <w:t>47</w:t>
       </w:r>
     </w:p>
     <w:p>
@@ -2550,7 +2550,7 @@
         </w:rPr>
         <w:t>Assessment flow</w:t>
         <w:tab/>
-        <w:t>46</w:t>
+        <w:t>47</w:t>
       </w:r>
       <w:r>
         <w:fldChar w:fldCharType="end"/>
@@ -6601,7 +6601,7 @@
         <w:rPr>
           <w:b w:val="0"/>
         </w:rPr>
-        <w:t xml:space="preserve"> Before anyone builds a team, the team needs a home: one folder of shared facts and rules, your own copy of Horizon's website to work on, and the one public link every post points to.</w:t>
+        <w:t xml:space="preserve"> Before anyone builds a team, the team needs a home: one folder of shared facts and rules, and your own copy of Horizon's website — the one every post links to.</w:t>
       </w:r>
     </w:p>
     <w:p>
@@ -6615,7 +6615,7 @@
         <w:rPr>
           <w:b w:val="0"/>
         </w:rPr>
-        <w:t xml:space="preserve"> the Horizon Marketing project, horizon-studio/ with AGENTS.md, and the public site link in the charter</w:t>
+        <w:t xml:space="preserve"> the Horizon Marketing project, horizon-studio/ with AGENTS.md, and your own copy of the site running at http://localhost:8080/</w:t>
       </w:r>
     </w:p>
     <w:p>
@@ -6634,7 +6634,7 @@
         <w:rPr>
           <w:b/>
         </w:rPr>
-        <w:t>Public site (the link in every post):</w:t>
+        <w:t>Your website (the link in every post):</w:t>
       </w:r>
       <w:r>
         <w:rPr>
@@ -6643,6 +6643,32 @@
         <w:t xml:space="preserve"> </w:t>
       </w:r>
       <w:hyperlink r:id="rId12">
+        <w:r>
+          <w:rPr>
+            <w:color w:val="0563C1"/>
+            <w:u w:val="single"/>
+          </w:rPr>
+          <w:t>http://localhost:8080/</w:t>
+        </w:r>
+      </w:hyperlink>
+    </w:p>
+    <w:p>
+      <w:pPr>
+        <w:pStyle w:val="ListBullet"/>
+      </w:pPr>
+      <w:r>
+        <w:rPr>
+          <w:b/>
+        </w:rPr>
+        <w:t>Public site (to look at only):</w:t>
+      </w:r>
+      <w:r>
+        <w:rPr>
+          <w:b w:val="0"/>
+        </w:rPr>
+        <w:t xml:space="preserve"> </w:t>
+      </w:r>
+      <w:hyperlink r:id="rId13">
         <w:r>
           <w:rPr>
             <w:color w:val="0563C1"/>
@@ -6857,7 +6883,7 @@
         </w:rPr>
         <w:t xml:space="preserve">Copy the prompts: </w:t>
       </w:r>
-      <w:hyperlink r:id="rId13">
+      <w:hyperlink r:id="rId14">
         <w:r>
           <w:rPr>
             <w:color w:val="0563C1"/>
@@ -6961,7 +6987,7 @@
         <w:rPr>
           <w:b w:val="0"/>
         </w:rPr>
-        <w:t xml:space="preserve"> — Ask: "Open web/site/index.html in my web browser." This is your own copy of Horizon's website; the public site never changes. Check the calculator shows S$693,138.</w:t>
+        <w:t xml:space="preserve"> — Ask: "Start my website." It opens at http://localhost:8080/ — your own copy of Horizon's website; every post links to it. Check the calculator shows S$693,138.</w:t>
       </w:r>
     </w:p>
     <w:p>
@@ -7042,7 +7068,7 @@
         <w:rPr>
           <w:sz w:val="21"/>
         </w:rPr>
-        <w:t>- Our copy of the site, which we edit and preview:</w:t>
+        <w:t>- Our copy of the site, which we edit: web/site/. "Start my website" runs scripts/serve-site.mjs in the background and opens http://localhost:8080/</w:t>
       </w:r>
       <w:r>
         <w:br/>
@@ -7051,16 +7077,7 @@
         <w:rPr>
           <w:sz w:val="21"/>
         </w:rPr>
-        <w:t xml:space="preserve">  web/site/index.html</w:t>
-      </w:r>
-      <w:r>
-        <w:br/>
-      </w:r>
-      <w:r>
-        <w:rPr>
-          <w:sz w:val="21"/>
-        </w:rPr>
-        <w:t>- Public site, the link every post points to (it never changes): https://tertiarycourses.github.io/TGS-2023036153-Multi-AI-Agents-Workflow-for-Content-Creation/</w:t>
+        <w:t>- Every post links to http://localhost:8080/ with UTM tags, never to a claude.ai artifact link.</w:t>
       </w:r>
     </w:p>
     <w:p>
@@ -7123,7 +7140,7 @@
         <w:rPr>
           <w:b w:val="0"/>
         </w:rPr>
-        <w:t>☐  AGENTS.md names your copy of the site and the public link every post points to.</w:t>
+        <w:t>☐  AGENTS.md names your copy of the site and the link every post points to.</w:t>
       </w:r>
     </w:p>
     <w:p>
@@ -7134,7 +7151,7 @@
         <w:rPr>
           <w:b w:val="0"/>
         </w:rPr>
-        <w:t>☐  Your own copy of the website opens in your browser; the calculator shows S$693,138.</w:t>
+        <w:t>☐  Your website opens at http://localhost:8080/; the calculator shows S$693,138.</w:t>
       </w:r>
     </w:p>
     <w:p>
@@ -7159,7 +7176,7 @@
         <w:rPr>
           <w:b w:val="0"/>
         </w:rPr>
-        <w:t xml:space="preserve"> — In your horizon-studio folder, open web/site and double-click index.html.</w:t>
+        <w:t xml:space="preserve"> — Say: "Start my website again." If the page still does not load, say: "Open web/site/index.html in my web browser."</w:t>
       </w:r>
     </w:p>
     <w:p>
@@ -7593,7 +7610,7 @@
         </w:rPr>
         <w:t xml:space="preserve">Copy the prompts: </w:t>
       </w:r>
-      <w:hyperlink r:id="rId14">
+      <w:hyperlink r:id="rId15">
         <w:r>
           <w:rPr>
             <w:color w:val="0563C1"/>
@@ -8488,7 +8505,7 @@
         </w:rPr>
         <w:t xml:space="preserve">Copy the prompts: </w:t>
       </w:r>
-      <w:hyperlink r:id="rId15">
+      <w:hyperlink r:id="rId16">
         <w:r>
           <w:rPr>
             <w:color w:val="0563C1"/>
@@ -9392,7 +9409,7 @@
         </w:rPr>
         <w:t xml:space="preserve">Copy the prompts: </w:t>
       </w:r>
-      <w:hyperlink r:id="rId16">
+      <w:hyperlink r:id="rId17">
         <w:r>
           <w:rPr>
             <w:color w:val="0563C1"/>
@@ -10412,7 +10429,7 @@
         </w:rPr>
         <w:t xml:space="preserve">Copy the prompts: </w:t>
       </w:r>
-      <w:hyperlink r:id="rId17">
+      <w:hyperlink r:id="rId18">
         <w:r>
           <w:rPr>
             <w:color w:val="0563C1"/>
@@ -11500,7 +11517,7 @@
         </w:rPr>
         <w:t xml:space="preserve">Copy the prompts: </w:t>
       </w:r>
-      <w:hyperlink r:id="rId18">
+      <w:hyperlink r:id="rId19">
         <w:r>
           <w:rPr>
             <w:color w:val="0563C1"/>
@@ -12085,7 +12102,7 @@
         </w:rPr>
         <w:t xml:space="preserve">Copy the prompts: </w:t>
       </w:r>
-      <w:hyperlink r:id="rId19">
+      <w:hyperlink r:id="rId20">
         <w:r>
           <w:rPr>
             <w:color w:val="0563C1"/>
@@ -12624,7 +12641,7 @@
         </w:rPr>
         <w:t xml:space="preserve">Copy the prompts: </w:t>
       </w:r>
-      <w:hyperlink r:id="rId20">
+      <w:hyperlink r:id="rId21">
         <w:r>
           <w:rPr>
             <w:color w:val="0563C1"/>
@@ -13063,7 +13080,7 @@
     </w:p>
     <w:p>
       <w:r>
-        <w:t>Slides 96–132. In this topic you will:</w:t>
+        <w:t>Slides 96–133. In this topic you will:</w:t>
       </w:r>
     </w:p>
     <w:p>
@@ -13362,7 +13379,7 @@
         </w:rPr>
         <w:t xml:space="preserve">Copy the prompts: </w:t>
       </w:r>
-      <w:hyperlink r:id="rId21">
+      <w:hyperlink r:id="rId22">
         <w:r>
           <w:rPr>
             <w:color w:val="0563C1"/>
@@ -14516,7 +14533,7 @@
         <w:rPr>
           <w:b w:val="0"/>
         </w:rPr>
-        <w:t xml:space="preserve"> 111–116</w:t>
+        <w:t xml:space="preserve"> 111–117</w:t>
       </w:r>
     </w:p>
     <w:p>
@@ -14540,7 +14557,7 @@
         </w:rPr>
         <w:t xml:space="preserve">Copy the prompts: </w:t>
       </w:r>
-      <w:hyperlink r:id="rId22">
+      <w:hyperlink r:id="rId23">
         <w:r>
           <w:rPr>
             <w:color w:val="0563C1"/>
@@ -14587,13 +14604,13 @@
         <w:rPr>
           <w:b/>
         </w:rPr>
-        <w:t>Install the kit</w:t>
-      </w:r>
-      <w:r>
-        <w:rPr>
-          <w:b w:val="0"/>
-        </w:rPr>
-        <w:t xml:space="preserve"> — Copy publisher-kit/scripts into scripts/. Then ask Codex to add a hook that blocks any command running approve.mjs, and trust it.</w:t>
+        <w:t>Get the latest kit</w:t>
+      </w:r>
+      <w:r>
+        <w:rPr>
+          <w:b w:val="0"/>
+        </w:rPr>
+        <w:t xml:space="preserve"> — Copy and paste Prompt A. Then ask Codex to add a hook that blocks any command running approve.mjs, and trust it.</w:t>
       </w:r>
     </w:p>
     <w:p>
@@ -14627,7 +14644,7 @@
         <w:rPr>
           <w:b w:val="0"/>
         </w:rPr>
-        <w:t xml:space="preserve"> — Copy and paste Prompt A. Watch the Subagents panel: Active, then Done.</w:t>
+        <w:t xml:space="preserve"> — After Codex says the kit is up to date, copy and paste Prompt B. Watch the Subagents panel: Active, then Done.</w:t>
       </w:r>
     </w:p>
     <w:p>
@@ -14678,15 +14695,32 @@
         <w:rPr>
           <w:b w:val="0"/>
         </w:rPr>
-        <w:t xml:space="preserve"> — After you have approved the posts, copy and paste Prompt B. Dry run first; --live only if your accounts are connected.</w:t>
-      </w:r>
-    </w:p>
-    <w:p>
-      <w:r>
-        <w:rPr>
-          <w:b/>
-        </w:rPr>
-        <w:t>PROMPT A — Codex: the social team</w:t>
+        <w:t xml:space="preserve"> — After you have approved the posts, copy and paste Prompt C. A dry run only: it shows what would be sent.</w:t>
+      </w:r>
+    </w:p>
+    <w:p>
+      <w:pPr>
+        <w:pStyle w:val="ListNumber"/>
+      </w:pPr>
+      <w:r>
+        <w:rPr>
+          <w:b/>
+        </w:rPr>
+        <w:t>Optional: post through the apps</w:t>
+      </w:r>
+      <w:r>
+        <w:rPr>
+          <w:b w:val="0"/>
+        </w:rPr>
+        <w:t xml:space="preserve"> — Follow "Optional: post through LinkedIn and Facebook" in this lab's README.</w:t>
+      </w:r>
+    </w:p>
+    <w:p>
+      <w:r>
+        <w:rPr>
+          <w:b/>
+        </w:rPr>
+        <w:t>PROMPT A — Codex: get the latest kit</w:t>
       </w:r>
     </w:p>
     <w:p>
@@ -14702,7 +14736,7 @@
         <w:rPr>
           <w:sz w:val="21"/>
         </w:rPr>
-        <w:t>You are the Lead. Plan Week 1 social from data/social-brief.md and strategy/calendar.csv. Use subagents in parallel, each following its card:</w:t>
+        <w:t>Bring this studio up to date with the course kit. From https://raw.githubusercontent.com/tertiarycourses/TGS-2023036153-Multi-AI-Agents-Workflow-for-Content-Creation/main/labs_chatgpt/horizon-studio/ download scripts/serve-site.mjs and data/publishing-spec.md, channel-formats.md, connect-accounts.md and env.example into the same places here. From https://raw.githubusercontent.com/tertiarycourses/TGS-2023036153-Multi-AI-Agents-Workflow-for-Content-Creation/main/labs_chatgpt/lab-10-campaign-2-social-week/assets/publisher-kit/scripts/ download approve.mjs, gate-hook.mjs, lib.mjs, publish.mjs and submit.mjs into scripts/. Replace old copies; touch nothing else. Then add this rule to AGENTS.md if it is missing:</w:t>
       </w:r>
       <w:r>
         <w:br/>
@@ -14711,24 +14745,15 @@
         <w:rPr>
           <w:sz w:val="21"/>
         </w:rPr>
-        <w:t>- content-creator: 1 LinkedIn + 1 Facebook post with linkedin-post, facebook-post and copywriting, one file each in content/social/week-01/, with the frontmatter in data/publishing-spec.md.</w:t>
-      </w:r>
-      <w:r>
-        <w:br/>
-      </w:r>
-      <w:r>
-        <w:rPr>
-          <w:sz w:val="21"/>
-        </w:rPr>
-        <w:t>- creative-designer: one image per post with $imagegen and alt text, from the brief. Save each as a PNG beside its post and fill in the post's image and alt lines, so the image is posted with it. Then run fact-check and fin-compliance on every post and send each fix back to the right subagent. When a post passes, run node scripts/submit.mjs on it. Publish nothing. Write for a business owner, in plain English: no codes, IDs, file names or line numbers; start with what it means and what I do next. Save a Word copy (.docx) of each result.</w:t>
-      </w:r>
-    </w:p>
-    <w:p>
-      <w:r>
-        <w:rPr>
-          <w:b/>
-        </w:rPr>
-        <w:t>PROMPT B — Codex: publish</w:t>
+        <w:t>every post links to http://localhost:8080/ with UTM tags. Then start my website and tell me in one line that the kit is up to date.</w:t>
+      </w:r>
+    </w:p>
+    <w:p>
+      <w:r>
+        <w:rPr>
+          <w:b/>
+        </w:rPr>
+        <w:t>PROMPT B — Codex: the social team</w:t>
       </w:r>
     </w:p>
     <w:p>
@@ -14744,6 +14769,48 @@
         <w:rPr>
           <w:sz w:val="21"/>
         </w:rPr>
+        <w:t>You are the Lead. Plan Week 1 social from data/social-brief.md and strategy/calendar.csv. Use subagents in parallel, each following its card:</w:t>
+      </w:r>
+      <w:r>
+        <w:br/>
+      </w:r>
+      <w:r>
+        <w:rPr>
+          <w:sz w:val="21"/>
+        </w:rPr>
+        <w:t>- content-creator: 1 LinkedIn + 1 Facebook post with linkedin-post, facebook-post and copywriting, one file each in content/social/week-01/, with the frontmatter in data/publishing-spec.md. Each post links to my website, http://localhost:8080/, with UTM tags.</w:t>
+      </w:r>
+      <w:r>
+        <w:br/>
+      </w:r>
+      <w:r>
+        <w:rPr>
+          <w:sz w:val="21"/>
+        </w:rPr>
+        <w:t>- creative-designer: one image per post with $imagegen and alt text, from the brief. Save each as a PNG beside its post and fill in the post's image and alt lines, so the image is posted with it. Then run fact-check and fin-compliance on every post and send each fix back to the right subagent. When a post passes, run node scripts/submit.mjs on it. Publish nothing. Write for a business owner, in plain English: no codes, IDs, file names or line numbers; start with what it means and what I do next. Save a Word copy (.docx) of each result.</w:t>
+      </w:r>
+    </w:p>
+    <w:p>
+      <w:r>
+        <w:rPr>
+          <w:b/>
+        </w:rPr>
+        <w:t>PROMPT C — Codex: publish</w:t>
+      </w:r>
+    </w:p>
+    <w:p>
+      <w:pPr>
+        <w:spacing w:after="80"/>
+        <w:ind w:left="432"/>
+        <w:pBdr>
+          <w:left w:val="single" w:sz="18" w:space="8" w:color="D97757"/>
+        </w:pBdr>
+        <w:shd w:val="clear" w:fill="FBF4EE"/>
+      </w:pPr>
+      <w:r>
+        <w:rPr>
+          <w:sz w:val="21"/>
+        </w:rPr>
         <w:t>For every Week 1 post approved in review/approvals.csv, run node scripts/publish.mjs &lt;id&gt; as a dry run and show me each request. Wait for me to say "go" before any --live run.</w:t>
       </w:r>
     </w:p>
@@ -14798,174 +14865,12 @@
         <w:rPr>
           <w:b/>
         </w:rPr>
-        <w:t>Check your work</w:t>
-      </w:r>
-    </w:p>
-    <w:p>
-      <w:pPr>
-        <w:pStyle w:val="ListBullet"/>
-      </w:pPr>
-      <w:r>
-        <w:rPr>
-          <w:b w:val="0"/>
-        </w:rPr>
-        <w:t>☐  The hook (or approve.mjs) stopped the agent from approving.</w:t>
-      </w:r>
-    </w:p>
-    <w:p>
-      <w:pPr>
-        <w:pStyle w:val="ListBullet"/>
-      </w:pPr>
-      <w:r>
-        <w:rPr>
-          <w:b w:val="0"/>
-        </w:rPr>
-        <w:t>☐  Two subagents ran in parallel; both reached Done.</w:t>
-      </w:r>
-    </w:p>
-    <w:p>
-      <w:pPr>
-        <w:pStyle w:val="ListBullet"/>
-      </w:pPr>
-      <w:r>
-        <w:rPr>
-          <w:b w:val="0"/>
-        </w:rPr>
-        <w:t>☐  The Lead sent at least one fix back to a subagent.</w:t>
-      </w:r>
-    </w:p>
-    <w:p>
-      <w:pPr>
-        <w:pStyle w:val="ListBullet"/>
-      </w:pPr>
-      <w:r>
-        <w:rPr>
-          <w:b w:val="0"/>
-        </w:rPr>
-        <w:t>☐  Two posts with images, alt text, frontmatter and UTM links; each dry run shows its image being uploaded.</w:t>
-      </w:r>
-    </w:p>
-    <w:p>
-      <w:pPr>
-        <w:pStyle w:val="ListBullet"/>
-      </w:pPr>
-      <w:r>
-        <w:rPr>
-          <w:b w:val="0"/>
-        </w:rPr>
-        <w:t>☐  You approved in your own terminal; the rows show your name and a hash.</w:t>
-      </w:r>
-    </w:p>
-    <w:p>
-      <w:pPr>
-        <w:pStyle w:val="ListBullet"/>
-      </w:pPr>
-      <w:r>
-        <w:rPr>
-          <w:b w:val="0"/>
-        </w:rPr>
-        <w:t>☐  Dry runs printed every request; nothing went live unless you said go.</w:t>
-      </w:r>
-    </w:p>
-    <w:p>
-      <w:r>
-        <w:rPr>
-          <w:b/>
-        </w:rPr>
-        <w:t>If it goes wrong</w:t>
-      </w:r>
-    </w:p>
-    <w:p>
-      <w:pPr>
-        <w:pStyle w:val="ListBullet"/>
-      </w:pPr>
-      <w:r>
-        <w:rPr>
-          <w:b/>
-        </w:rPr>
-        <w:t>Images contain wrong text</w:t>
-      </w:r>
-      <w:r>
-        <w:rPr>
-          <w:b w:val="0"/>
-        </w:rPr>
-        <w:t xml:space="preserve"> — Ask for text-free artwork and put the words in the post instead.</w:t>
-      </w:r>
-    </w:p>
-    <w:p>
-      <w:pPr>
-        <w:pStyle w:val="ListBullet"/>
-      </w:pPr>
-      <w:r>
-        <w:rPr>
-          <w:b/>
-        </w:rPr>
-        <w:t>LinkedIn returns 426</w:t>
-      </w:r>
-      <w:r>
-        <w:rPr>
-          <w:b w:val="0"/>
-        </w:rPr>
-        <w:t xml:space="preserve"> — LINKEDIN_VERSION must be a recent YYYYMM.</w:t>
-      </w:r>
-    </w:p>
-    <w:p>
-      <w:r>
-        <w:rPr>
-          <w:b/>
-        </w:rPr>
-        <w:t>Stretch</w:t>
-      </w:r>
-    </w:p>
-    <w:p>
-      <w:pPr>
-        <w:pStyle w:val="ListBullet"/>
-      </w:pPr>
-      <w:r>
-        <w:rPr>
-          <w:b w:val="0"/>
-        </w:rPr>
-        <w:t>Add the growth-analyst to suggest the best posting time per post from channel-benchmarks.csv.</w:t>
-      </w:r>
-    </w:p>
-    <w:p>
-      <w:pPr>
-        <w:pStyle w:val="ListBullet"/>
-      </w:pPr>
-      <w:r>
-        <w:rPr>
-          <w:b w:val="0"/>
-        </w:rPr>
-        <w:t>Link each LinkedIn post to the Lab 8 blog article.</w:t>
-      </w:r>
-    </w:p>
-    <w:p>
-      <w:r>
-        <w:rPr>
-          <w:i/>
-        </w:rPr>
-        <w:t>Why it matters: Parallel subagents are fast; the Lead's review is what makes them safe.</w:t>
-      </w:r>
-    </w:p>
-    <w:p>
-      <w:pPr>
-        <w:pStyle w:val="Heading2"/>
-      </w:pPr>
-      <w:r>
-        <w:t>Key ideas for Lab 11</w:t>
-      </w:r>
-    </w:p>
-    <w:p>
-      <w:pPr>
-        <w:pStyle w:val="Heading3"/>
-      </w:pPr>
-      <w:r>
-        <w:t>Campaign 3: Newsletter + Landing Page</w:t>
-      </w:r>
-    </w:p>
-    <w:p>
-      <w:r>
-        <w:t>Lab 11: three specialists, one email and one page, consent first.</w:t>
+        <w:t>Optional: post through LinkedIn and Facebook</w:t>
+      </w:r>
+    </w:p>
+    <w:p>
+      <w:r>
+        <w:t>About 20 minutes, after you have approved the posts. Use test accounts only: your own LinkedIn profile and a test Facebook Page you manage. Skip any post you already posted by hand. The link in each post opens your own website, so it works only on your computer.</w:t>
       </w:r>
     </w:p>
     <w:p>
@@ -14980,6 +14885,321 @@
         <w:rPr>
           <w:b/>
         </w:rPr>
+        <w:t>Make your key file</w:t>
+      </w:r>
+      <w:r>
+        <w:rPr>
+          <w:b w:val="0"/>
+        </w:rPr>
+        <w:t xml:space="preserve"> — Ask Codex: "Make my .env file from data/env.example and open it in a text editor." Your keys go only in this file — never in the chat.</w:t>
+      </w:r>
+    </w:p>
+    <w:p>
+      <w:pPr>
+        <w:pStyle w:val="ListNumber"/>
+      </w:pPr>
+      <w:r>
+        <w:rPr>
+          <w:b/>
+        </w:rPr>
+        <w:t>LinkedIn app</w:t>
+      </w:r>
+      <w:r>
+        <w:rPr>
+          <w:b w:val="0"/>
+        </w:rPr>
+        <w:t xml:space="preserve"> — Go to linkedin.com/developers → Create app (link it to a LinkedIn Page; a test Page is fine). Under Products add Share on LinkedIn and Sign In with LinkedIn using OpenID Connect.</w:t>
+      </w:r>
+    </w:p>
+    <w:p>
+      <w:pPr>
+        <w:pStyle w:val="ListNumber"/>
+      </w:pPr>
+      <w:r>
+        <w:rPr>
+          <w:b/>
+        </w:rPr>
+        <w:t>LinkedIn key</w:t>
+      </w:r>
+      <w:r>
+        <w:rPr>
+          <w:b w:val="0"/>
+        </w:rPr>
+        <w:t xml:space="preserve"> — Auth → OAuth 2.0 tools → create a token with openid, profile and w_member_social. Paste it after LINKEDIN_ACCESS_TOKEN= in .env and save.</w:t>
+      </w:r>
+    </w:p>
+    <w:p>
+      <w:pPr>
+        <w:pStyle w:val="ListNumber"/>
+      </w:pPr>
+      <w:r>
+        <w:rPr>
+          <w:b/>
+        </w:rPr>
+        <w:t>Your LinkedIn ID</w:t>
+      </w:r>
+      <w:r>
+        <w:rPr>
+          <w:b w:val="0"/>
+        </w:rPr>
+        <w:t xml:space="preserve"> — Ask Codex: "Look up my LinkedIn author ID with the token in .env and fill it in. Do not show me the token."</w:t>
+      </w:r>
+    </w:p>
+    <w:p>
+      <w:pPr>
+        <w:pStyle w:val="ListNumber"/>
+      </w:pPr>
+      <w:r>
+        <w:rPr>
+          <w:b/>
+        </w:rPr>
+        <w:t>Facebook app</w:t>
+      </w:r>
+      <w:r>
+        <w:rPr>
+          <w:b w:val="0"/>
+        </w:rPr>
+        <w:t xml:space="preserve"> — Go to developers.facebook.com → Create app → Business. Open Tools → Graph API Explorer and pick your app. Add pages_manage_posts, pages_read_engagement and pages_show_list, then Generate token and choose your test Page.</w:t>
+      </w:r>
+    </w:p>
+    <w:p>
+      <w:pPr>
+        <w:pStyle w:val="ListNumber"/>
+      </w:pPr>
+      <w:r>
+        <w:rPr>
+          <w:b/>
+        </w:rPr>
+        <w:t>Facebook key</w:t>
+      </w:r>
+      <w:r>
+        <w:rPr>
+          <w:b w:val="0"/>
+        </w:rPr>
+        <w:t xml:space="preserve"> — Click Get Page Access Token. Paste it after FB_PAGE_TOKEN= in .env, and your Page ID (Page → About → Page transparency) after FB_PAGE_ID=. Save. This key lasts about an hour, so do it just before you post.</w:t>
+      </w:r>
+    </w:p>
+    <w:p>
+      <w:pPr>
+        <w:pStyle w:val="ListNumber"/>
+      </w:pPr>
+      <w:r>
+        <w:rPr>
+          <w:b/>
+        </w:rPr>
+        <w:t>Dry run</w:t>
+      </w:r>
+      <w:r>
+        <w:rPr>
+          <w:b w:val="0"/>
+        </w:rPr>
+        <w:t xml:space="preserve"> — Type: "Do a dry run of publishing the approved Week 1 posts and show each one as an artifact. Wait for my go." Each card should show your key partly hidden (like LITO…), not "missing".</w:t>
+      </w:r>
+    </w:p>
+    <w:p>
+      <w:pPr>
+        <w:pStyle w:val="ListNumber"/>
+      </w:pPr>
+      <w:r>
+        <w:rPr>
+          <w:b/>
+        </w:rPr>
+        <w:t>Go</w:t>
+      </w:r>
+      <w:r>
+        <w:rPr>
+          <w:b w:val="0"/>
+        </w:rPr>
+        <w:t xml:space="preserve"> — Type "go" for each post you want live. It appears on LinkedIn or your Facebook Page with its image, and the artifact shows its link.</w:t>
+      </w:r>
+    </w:p>
+    <w:p>
+      <w:r>
+        <w:rPr>
+          <w:b/>
+        </w:rPr>
+        <w:t>Check your work</w:t>
+      </w:r>
+    </w:p>
+    <w:p>
+      <w:pPr>
+        <w:pStyle w:val="ListBullet"/>
+      </w:pPr>
+      <w:r>
+        <w:rPr>
+          <w:b w:val="0"/>
+        </w:rPr>
+        <w:t>☐  The hook (or approve.mjs) stopped the agent from approving.</w:t>
+      </w:r>
+    </w:p>
+    <w:p>
+      <w:pPr>
+        <w:pStyle w:val="ListBullet"/>
+      </w:pPr>
+      <w:r>
+        <w:rPr>
+          <w:b w:val="0"/>
+        </w:rPr>
+        <w:t>☐  Two subagents ran in parallel; both reached Done.</w:t>
+      </w:r>
+    </w:p>
+    <w:p>
+      <w:pPr>
+        <w:pStyle w:val="ListBullet"/>
+      </w:pPr>
+      <w:r>
+        <w:rPr>
+          <w:b w:val="0"/>
+        </w:rPr>
+        <w:t>☐  The Lead sent at least one fix back to a subagent.</w:t>
+      </w:r>
+    </w:p>
+    <w:p>
+      <w:pPr>
+        <w:pStyle w:val="ListBullet"/>
+      </w:pPr>
+      <w:r>
+        <w:rPr>
+          <w:b w:val="0"/>
+        </w:rPr>
+        <w:t>☐  Two posts with images, alt text, frontmatter and UTM links; each dry run shows its image being uploaded.</w:t>
+      </w:r>
+    </w:p>
+    <w:p>
+      <w:pPr>
+        <w:pStyle w:val="ListBullet"/>
+      </w:pPr>
+      <w:r>
+        <w:rPr>
+          <w:b w:val="0"/>
+        </w:rPr>
+        <w:t>☐  You approved in your own terminal; the rows show your name and a hash.</w:t>
+      </w:r>
+    </w:p>
+    <w:p>
+      <w:pPr>
+        <w:pStyle w:val="ListBullet"/>
+      </w:pPr>
+      <w:r>
+        <w:rPr>
+          <w:b w:val="0"/>
+        </w:rPr>
+        <w:t>☐  Dry runs printed every request; nothing went live unless you said go.</w:t>
+      </w:r>
+    </w:p>
+    <w:p>
+      <w:r>
+        <w:rPr>
+          <w:b/>
+        </w:rPr>
+        <w:t>If it goes wrong</w:t>
+      </w:r>
+    </w:p>
+    <w:p>
+      <w:pPr>
+        <w:pStyle w:val="ListBullet"/>
+      </w:pPr>
+      <w:r>
+        <w:rPr>
+          <w:b/>
+        </w:rPr>
+        <w:t>Images contain wrong text</w:t>
+      </w:r>
+      <w:r>
+        <w:rPr>
+          <w:b w:val="0"/>
+        </w:rPr>
+        <w:t xml:space="preserve"> — Ask for text-free artwork and put the words in the post instead.</w:t>
+      </w:r>
+    </w:p>
+    <w:p>
+      <w:pPr>
+        <w:pStyle w:val="ListBullet"/>
+      </w:pPr>
+      <w:r>
+        <w:rPr>
+          <w:b/>
+        </w:rPr>
+        <w:t>LinkedIn returns 426</w:t>
+      </w:r>
+      <w:r>
+        <w:rPr>
+          <w:b w:val="0"/>
+        </w:rPr>
+        <w:t xml:space="preserve"> — LINKEDIN_VERSION must be a recent YYYYMM.</w:t>
+      </w:r>
+    </w:p>
+    <w:p>
+      <w:r>
+        <w:rPr>
+          <w:b/>
+        </w:rPr>
+        <w:t>Stretch</w:t>
+      </w:r>
+    </w:p>
+    <w:p>
+      <w:pPr>
+        <w:pStyle w:val="ListBullet"/>
+      </w:pPr>
+      <w:r>
+        <w:rPr>
+          <w:b w:val="0"/>
+        </w:rPr>
+        <w:t>Add the growth-analyst to suggest the best posting time per post from channel-benchmarks.csv.</w:t>
+      </w:r>
+    </w:p>
+    <w:p>
+      <w:pPr>
+        <w:pStyle w:val="ListBullet"/>
+      </w:pPr>
+      <w:r>
+        <w:rPr>
+          <w:b w:val="0"/>
+        </w:rPr>
+        <w:t>Link each LinkedIn post to the Lab 8 blog article.</w:t>
+      </w:r>
+    </w:p>
+    <w:p>
+      <w:r>
+        <w:rPr>
+          <w:i/>
+        </w:rPr>
+        <w:t>Why it matters: Parallel subagents are fast; the Lead's review is what makes them safe.</w:t>
+      </w:r>
+    </w:p>
+    <w:p>
+      <w:pPr>
+        <w:pStyle w:val="Heading2"/>
+      </w:pPr>
+      <w:r>
+        <w:t>Key ideas for Lab 11</w:t>
+      </w:r>
+    </w:p>
+    <w:p>
+      <w:pPr>
+        <w:pStyle w:val="Heading3"/>
+      </w:pPr>
+      <w:r>
+        <w:t>Campaign 3: Newsletter + Landing Page</w:t>
+      </w:r>
+    </w:p>
+    <w:p>
+      <w:r>
+        <w:t>Lab 11: three specialists, one email and one page, consent first.</w:t>
+      </w:r>
+    </w:p>
+    <w:p>
+      <w:pPr>
+        <w:pStyle w:val="ListNumber"/>
+        <w:numPr>
+          <w:ilvl w:val="0"/>
+          <w:numId w:val="33"/>
+        </w:numPr>
+      </w:pPr>
+      <w:r>
+        <w:rPr>
+          <w:b/>
+        </w:rPr>
         <w:t>Content Creator</w:t>
       </w:r>
       <w:r>
@@ -15220,7 +15440,7 @@
         <w:rPr>
           <w:b w:val="0"/>
         </w:rPr>
-        <w:t xml:space="preserve"> 119–124</w:t>
+        <w:t xml:space="preserve"> 120–125</w:t>
       </w:r>
     </w:p>
     <w:p>
@@ -15244,7 +15464,7 @@
         </w:rPr>
         <w:t xml:space="preserve">Copy the prompts: </w:t>
       </w:r>
-      <w:hyperlink r:id="rId23">
+      <w:hyperlink r:id="rId24">
         <w:r>
           <w:rPr>
             <w:color w:val="0563C1"/>
@@ -15267,7 +15487,7 @@
         <w:pStyle w:val="ListNumber"/>
         <w:numPr>
           <w:ilvl w:val="0"/>
-          <w:numId w:val="33"/>
+          <w:numId w:val="34"/>
         </w:numPr>
       </w:pPr>
       <w:r>
@@ -15803,7 +16023,7 @@
         <w:rPr>
           <w:b w:val="0"/>
         </w:rPr>
-        <w:t xml:space="preserve"> 126–131</w:t>
+        <w:t xml:space="preserve"> 127–132</w:t>
       </w:r>
     </w:p>
     <w:p>
@@ -15827,7 +16047,7 @@
         </w:rPr>
         <w:t xml:space="preserve">Copy the prompts: </w:t>
       </w:r>
-      <w:hyperlink r:id="rId24">
+      <w:hyperlink r:id="rId25">
         <w:r>
           <w:rPr>
             <w:color w:val="0563C1"/>
@@ -15850,7 +16070,7 @@
         <w:pStyle w:val="ListNumber"/>
         <w:numPr>
           <w:ilvl w:val="0"/>
-          <w:numId w:val="34"/>
+          <w:numId w:val="35"/>
         </w:numPr>
       </w:pPr>
       <w:r>
@@ -16313,7 +16533,7 @@
     </w:p>
     <w:p>
       <w:r>
-        <w:t>Slides 133–162. In this topic you will:</w:t>
+        <w:t>Slides 134–163. In this topic you will:</w:t>
       </w:r>
     </w:p>
     <w:p>
@@ -16386,7 +16606,7 @@
         <w:pStyle w:val="ListNumber"/>
         <w:numPr>
           <w:ilvl w:val="0"/>
-          <w:numId w:val="35"/>
+          <w:numId w:val="36"/>
         </w:numPr>
       </w:pPr>
       <w:r>
@@ -16641,7 +16861,7 @@
         <w:rPr>
           <w:b w:val="0"/>
         </w:rPr>
-        <w:t xml:space="preserve"> 136–140</w:t>
+        <w:t xml:space="preserve"> 137–141</w:t>
       </w:r>
     </w:p>
     <w:p>
@@ -16665,7 +16885,7 @@
         </w:rPr>
         <w:t xml:space="preserve">Copy the prompts: </w:t>
       </w:r>
-      <w:hyperlink r:id="rId25">
+      <w:hyperlink r:id="rId26">
         <w:r>
           <w:rPr>
             <w:color w:val="0563C1"/>
@@ -16688,7 +16908,7 @@
         <w:pStyle w:val="ListNumber"/>
         <w:numPr>
           <w:ilvl w:val="0"/>
-          <w:numId w:val="36"/>
+          <w:numId w:val="37"/>
         </w:numPr>
       </w:pPr>
       <w:r>
@@ -17560,7 +17780,7 @@
         <w:rPr>
           <w:b w:val="0"/>
         </w:rPr>
-        <w:t xml:space="preserve"> 143–148</w:t>
+        <w:t xml:space="preserve"> 144–149</w:t>
       </w:r>
     </w:p>
     <w:p>
@@ -17584,7 +17804,7 @@
         </w:rPr>
         <w:t xml:space="preserve">Copy the prompts: </w:t>
       </w:r>
-      <w:hyperlink r:id="rId26">
+      <w:hyperlink r:id="rId27">
         <w:r>
           <w:rPr>
             <w:color w:val="0563C1"/>
@@ -17607,7 +17827,7 @@
         <w:pStyle w:val="ListNumber"/>
         <w:numPr>
           <w:ilvl w:val="0"/>
-          <w:numId w:val="37"/>
+          <w:numId w:val="38"/>
         </w:numPr>
       </w:pPr>
       <w:r>
@@ -17990,7 +18210,7 @@
         <w:pStyle w:val="ListNumber"/>
         <w:numPr>
           <w:ilvl w:val="0"/>
-          <w:numId w:val="38"/>
+          <w:numId w:val="39"/>
         </w:numPr>
       </w:pPr>
       <w:r>
@@ -18181,7 +18401,7 @@
         <w:rPr>
           <w:b w:val="0"/>
         </w:rPr>
-        <w:t xml:space="preserve"> 151–154</w:t>
+        <w:t xml:space="preserve"> 152–155</w:t>
       </w:r>
     </w:p>
     <w:p>
@@ -18205,7 +18425,7 @@
         </w:rPr>
         <w:t xml:space="preserve">Copy the prompts: </w:t>
       </w:r>
-      <w:hyperlink r:id="rId27">
+      <w:hyperlink r:id="rId28">
         <w:r>
           <w:rPr>
             <w:color w:val="0563C1"/>
@@ -18228,7 +18448,7 @@
         <w:pStyle w:val="ListNumber"/>
         <w:numPr>
           <w:ilvl w:val="0"/>
-          <w:numId w:val="39"/>
+          <w:numId w:val="40"/>
         </w:numPr>
       </w:pPr>
       <w:r>
@@ -18569,7 +18789,7 @@
         <w:pStyle w:val="ListNumber"/>
         <w:numPr>
           <w:ilvl w:val="0"/>
-          <w:numId w:val="40"/>
+          <w:numId w:val="41"/>
         </w:numPr>
       </w:pPr>
       <w:r>
@@ -19132,7 +19352,7 @@
         <w:pStyle w:val="ListNumber"/>
         <w:numPr>
           <w:ilvl w:val="0"/>
-          <w:numId w:val="41"/>
+          <w:numId w:val="42"/>
         </w:numPr>
       </w:pPr>
       <w:r>
@@ -19642,6 +19862,12 @@
     </w:lvlOverride>
   </w:num>
   <w:num w:numId="41">
+    <w:abstractNumId w:val="7"/>
+    <w:lvlOverride w:ilvl="0">
+      <w:startOverride w:val="1"/>
+    </w:lvlOverride>
+  </w:num>
+  <w:num w:numId="42">
     <w:abstractNumId w:val="7"/>
     <w:lvlOverride w:ilvl="0">
       <w:startOverride w:val="1"/>

</xml_diff>